<commit_message>
Simplify Lab-3 to two files
</commit_message>
<xml_diff>
--- a/Lab-3/Lab3_Report.docx
+++ b/Lab-3/Lab3_Report.docx
@@ -4,1445 +4,19 @@
   <w:body>
     <w:p>
       <w:pPr>
-        <w:jc w:val="center"/>
+        <w:jc w:val="both"/>
       </w:pPr>
       <w:r>
         <w:rPr>
-          <w:b/>
-          <w:color w:val="1F4E79"/>
-          <w:sz w:val="44"/>
+          <w:rFonts w:ascii="Calibri" w:hAnsi="Calibri"/>
+          <w:sz w:val="22"/>
         </w:rPr>
-        <w:t>Lab 3 Report</w:t>
-      </w:r>
-    </w:p>
-    <w:p>
-      <w:pPr>
-        <w:jc w:val="center"/>
-      </w:pPr>
-      <w:r>
-        <w:rPr>
-          <w:sz w:val="24"/>
-        </w:rPr>
-        <w:t>Uninformed search: BFS, DFS, DLS, IDDFS and UCS</w:t>
-      </w:r>
-    </w:p>
-    <w:p>
-      <w:pPr>
-        <w:jc w:val="center"/>
-      </w:pPr>
-      <w:r>
-        <w:rPr>
-          <w:b/>
-        </w:rPr>
-        <w:t>Muhammad Ahmad | Roll No. 395</w:t>
-      </w:r>
-    </w:p>
-    <w:p>
-      <w:r>
-        <w:t>This report records the implementation, assumptions, observed output, and limitations of the lab work. Thresholds and graph weights are synthetic exercise values.</w:t>
-      </w:r>
-    </w:p>
-    <w:p>
-      <w:pPr>
-        <w:pStyle w:val="Heading1"/>
-      </w:pPr>
-      <w:r>
-        <w:t>1. Problem formulation</w:t>
-      </w:r>
-    </w:p>
-    <w:p>
-      <w:r>
-        <w:t>Initial state: A. Goal test: node equals G. Actions: move along an outgoing graph edge. State: current graph node and path. Path cost: one per edge for the original graph, then non-negative weights for the weighted extension. Successor order is kept exactly as supplied.</w:t>
-      </w:r>
-    </w:p>
-    <w:p>
-      <w:pPr>
-        <w:pStyle w:val="Heading1"/>
-      </w:pPr>
-      <w:r>
-        <w:t>2. BFS and DFS manual traces</w:t>
-      </w:r>
-    </w:p>
-    <w:tbl>
-      <w:tblPr>
-        <w:tblStyle w:val="TableGrid"/>
-        <w:tblW w:type="auto" w:w="0"/>
-        <w:jc w:val="center"/>
-        <w:tblLook w:firstColumn="1" w:firstRow="1" w:lastColumn="0" w:lastRow="0" w:noHBand="0" w:noVBand="1" w:val="04A0"/>
-      </w:tblPr>
-      <w:tblGrid>
-        <w:gridCol w:w="3360"/>
-        <w:gridCol w:w="3360"/>
-        <w:gridCol w:w="3360"/>
-      </w:tblGrid>
-      <w:tr>
-        <w:tc>
-          <w:tcPr>
-            <w:tcW w:type="dxa" w:w="3360"/>
-            <w:vAlign w:val="center"/>
-            <w:shd w:fill="D9EAF7"/>
-          </w:tcPr>
-          <w:p>
-            <w:r/>
-            <w:r>
-              <w:rPr>
-                <w:b/>
-                <w:sz w:val="18"/>
-              </w:rPr>
-              <w:t>Algorithm</w:t>
-            </w:r>
-          </w:p>
-        </w:tc>
-        <w:tc>
-          <w:tcPr>
-            <w:tcW w:type="dxa" w:w="3360"/>
-            <w:vAlign w:val="center"/>
-            <w:shd w:fill="D9EAF7"/>
-          </w:tcPr>
-          <w:p>
-            <w:r/>
-            <w:r>
-              <w:rPr>
-                <w:b/>
-                <w:sz w:val="18"/>
-              </w:rPr>
-              <w:t>Processed order</w:t>
-            </w:r>
-          </w:p>
-        </w:tc>
-        <w:tc>
-          <w:tcPr>
-            <w:tcW w:type="dxa" w:w="3360"/>
-            <w:vAlign w:val="center"/>
-            <w:shd w:fill="D9EAF7"/>
-          </w:tcPr>
-          <w:p>
-            <w:r/>
-            <w:r>
-              <w:rPr>
-                <w:b/>
-                <w:sz w:val="18"/>
-              </w:rPr>
-              <w:t>Returned path</w:t>
-            </w:r>
-          </w:p>
-        </w:tc>
-      </w:tr>
-      <w:tr>
-        <w:tc>
-          <w:tcPr>
-            <w:tcW w:type="dxa" w:w="3360"/>
-            <w:vAlign w:val="center"/>
-          </w:tcPr>
-          <w:p>
-            <w:r/>
-            <w:r>
-              <w:rPr>
-                <w:b w:val="0"/>
-                <w:sz w:val="18"/>
-              </w:rPr>
-              <w:t>BFS</w:t>
-            </w:r>
-          </w:p>
-        </w:tc>
-        <w:tc>
-          <w:tcPr>
-            <w:tcW w:type="dxa" w:w="3360"/>
-            <w:vAlign w:val="center"/>
-          </w:tcPr>
-          <w:p>
-            <w:r/>
-            <w:r>
-              <w:rPr>
-                <w:b w:val="0"/>
-                <w:sz w:val="18"/>
-              </w:rPr>
-              <w:t>A, B, C, D, E, F, G</w:t>
-            </w:r>
-          </w:p>
-        </w:tc>
-        <w:tc>
-          <w:tcPr>
-            <w:tcW w:type="dxa" w:w="3360"/>
-            <w:vAlign w:val="center"/>
-          </w:tcPr>
-          <w:p>
-            <w:r/>
-            <w:r>
-              <w:rPr>
-                <w:b w:val="0"/>
-                <w:sz w:val="18"/>
-              </w:rPr>
-              <w:t>A → B → E → G</w:t>
-            </w:r>
-          </w:p>
-        </w:tc>
-      </w:tr>
-      <w:tr>
-        <w:tc>
-          <w:tcPr>
-            <w:tcW w:type="dxa" w:w="3360"/>
-            <w:vAlign w:val="center"/>
-          </w:tcPr>
-          <w:p>
-            <w:r/>
-            <w:r>
-              <w:rPr>
-                <w:b w:val="0"/>
-                <w:sz w:val="18"/>
-              </w:rPr>
-              <w:t>DFS</w:t>
-            </w:r>
-          </w:p>
-        </w:tc>
-        <w:tc>
-          <w:tcPr>
-            <w:tcW w:type="dxa" w:w="3360"/>
-            <w:vAlign w:val="center"/>
-          </w:tcPr>
-          <w:p>
-            <w:r/>
-            <w:r>
-              <w:rPr>
-                <w:b w:val="0"/>
-                <w:sz w:val="18"/>
-              </w:rPr>
-              <w:t>A, B, D, E, G</w:t>
-            </w:r>
-          </w:p>
-        </w:tc>
-        <w:tc>
-          <w:tcPr>
-            <w:tcW w:type="dxa" w:w="3360"/>
-            <w:vAlign w:val="center"/>
-          </w:tcPr>
-          <w:p>
-            <w:r/>
-            <w:r>
-              <w:rPr>
-                <w:b w:val="0"/>
-                <w:sz w:val="18"/>
-              </w:rPr>
-              <w:t>A → B → E → G</w:t>
-            </w:r>
-          </w:p>
-        </w:tc>
-      </w:tr>
-    </w:tbl>
-    <w:p/>
-    <w:p>
-      <w:r>
-        <w:t>BFS uses a queue and finds the shallowest route under equal step costs. DFS uses a stack and reverses insertion so the first listed neighbour is processed first. Both return the same path here because the graph has only one route to G, but their processing traces are different.</w:t>
-      </w:r>
-    </w:p>
-    <w:p>
-      <w:pPr>
-        <w:pStyle w:val="NoSpacing"/>
-      </w:pPr>
-      <w:r>
-        <w:rPr>
-          <w:rFonts w:ascii="Consolas" w:hAnsi="Consolas"/>
-          <w:sz w:val="17"/>
-        </w:rPr>
-        <w:t>BFS path: ['A', 'B', 'E', 'G']</w:t>
-        <w:br/>
-        <w:t>BFS visit order: ['A', 'B', 'C', 'D', 'E', 'F', 'G']</w:t>
-        <w:br/>
-        <w:t>1 processed A frontier []</w:t>
-        <w:br/>
-        <w:t>2 processed B frontier ['C']</w:t>
-        <w:br/>
-        <w:t>3 processed C frontier ['D', 'E']</w:t>
-        <w:br/>
-        <w:t>4 processed D frontier ['E', 'F']</w:t>
-        <w:br/>
-        <w:t>5 processed E frontier ['F']</w:t>
-        <w:br/>
-        <w:t>6 processed F frontier ['G']</w:t>
-        <w:br/>
-        <w:t>7 processed G frontier []</w:t>
-        <w:br/>
-        <w:t>DFS path: ['A', 'B', 'E', 'G']</w:t>
-        <w:br/>
-        <w:t>DFS visit order: ['A', 'B', 'D', 'E', 'G']</w:t>
-        <w:br/>
-        <w:t>1 processed A frontier []</w:t>
-        <w:br/>
-        <w:t>2 processed B frontier ['C']</w:t>
-        <w:br/>
-        <w:t>3 processed D frontier ['C', 'E']</w:t>
-        <w:br/>
-        <w:t>4 processed E frontier ['C']</w:t>
-        <w:br/>
-        <w:t>5 processed G frontier ['C']</w:t>
-      </w:r>
-    </w:p>
-    <w:p>
-      <w:pPr>
-        <w:pStyle w:val="Heading1"/>
-      </w:pPr>
-      <w:r>
-        <w:t>3. DLS and IDDFS</w:t>
-      </w:r>
-    </w:p>
-    <w:tbl>
-      <w:tblPr>
-        <w:tblStyle w:val="TableGrid"/>
-        <w:tblW w:type="auto" w:w="0"/>
-        <w:jc w:val="center"/>
-        <w:tblLook w:firstColumn="1" w:firstRow="1" w:lastColumn="0" w:lastRow="0" w:noHBand="0" w:noVBand="1" w:val="04A0"/>
-      </w:tblPr>
-      <w:tblGrid>
-        <w:gridCol w:w="3360"/>
-        <w:gridCol w:w="3360"/>
-        <w:gridCol w:w="3360"/>
-      </w:tblGrid>
-      <w:tr>
-        <w:tc>
-          <w:tcPr>
-            <w:tcW w:type="dxa" w:w="3360"/>
-            <w:vAlign w:val="center"/>
-            <w:shd w:fill="D9EAF7"/>
-          </w:tcPr>
-          <w:p>
-            <w:r/>
-            <w:r>
-              <w:rPr>
-                <w:b/>
-                <w:sz w:val="18"/>
-              </w:rPr>
-              <w:t>Limit</w:t>
-            </w:r>
-          </w:p>
-        </w:tc>
-        <w:tc>
-          <w:tcPr>
-            <w:tcW w:type="dxa" w:w="3360"/>
-            <w:vAlign w:val="center"/>
-            <w:shd w:fill="D9EAF7"/>
-          </w:tcPr>
-          <w:p>
-            <w:r/>
-            <w:r>
-              <w:rPr>
-                <w:b/>
-                <w:sz w:val="18"/>
-              </w:rPr>
-              <w:t>DLS status</w:t>
-            </w:r>
-          </w:p>
-        </w:tc>
-        <w:tc>
-          <w:tcPr>
-            <w:tcW w:type="dxa" w:w="3360"/>
-            <w:vAlign w:val="center"/>
-            <w:shd w:fill="D9EAF7"/>
-          </w:tcPr>
-          <w:p>
-            <w:r/>
-            <w:r>
-              <w:rPr>
-                <w:b/>
-                <w:sz w:val="18"/>
-              </w:rPr>
-              <w:t>Path</w:t>
-            </w:r>
-          </w:p>
-        </w:tc>
-      </w:tr>
-      <w:tr>
-        <w:tc>
-          <w:tcPr>
-            <w:tcW w:type="dxa" w:w="3360"/>
-            <w:vAlign w:val="center"/>
-          </w:tcPr>
-          <w:p>
-            <w:r/>
-            <w:r>
-              <w:rPr>
-                <w:b w:val="0"/>
-                <w:sz w:val="18"/>
-              </w:rPr>
-              <w:t>1</w:t>
-            </w:r>
-          </w:p>
-        </w:tc>
-        <w:tc>
-          <w:tcPr>
-            <w:tcW w:type="dxa" w:w="3360"/>
-            <w:vAlign w:val="center"/>
-          </w:tcPr>
-          <w:p>
-            <w:r/>
-            <w:r>
-              <w:rPr>
-                <w:b w:val="0"/>
-                <w:sz w:val="18"/>
-              </w:rPr>
-              <w:t>CUTOFF</w:t>
-            </w:r>
-          </w:p>
-        </w:tc>
-        <w:tc>
-          <w:tcPr>
-            <w:tcW w:type="dxa" w:w="3360"/>
-            <w:vAlign w:val="center"/>
-          </w:tcPr>
-          <w:p>
-            <w:r/>
-            <w:r>
-              <w:rPr>
-                <w:b w:val="0"/>
-                <w:sz w:val="18"/>
-              </w:rPr>
-              <w:t>None</w:t>
-            </w:r>
-          </w:p>
-        </w:tc>
-      </w:tr>
-      <w:tr>
-        <w:tc>
-          <w:tcPr>
-            <w:tcW w:type="dxa" w:w="3360"/>
-            <w:vAlign w:val="center"/>
-          </w:tcPr>
-          <w:p>
-            <w:r/>
-            <w:r>
-              <w:rPr>
-                <w:b w:val="0"/>
-                <w:sz w:val="18"/>
-              </w:rPr>
-              <w:t>2</w:t>
-            </w:r>
-          </w:p>
-        </w:tc>
-        <w:tc>
-          <w:tcPr>
-            <w:tcW w:type="dxa" w:w="3360"/>
-            <w:vAlign w:val="center"/>
-          </w:tcPr>
-          <w:p>
-            <w:r/>
-            <w:r>
-              <w:rPr>
-                <w:b w:val="0"/>
-                <w:sz w:val="18"/>
-              </w:rPr>
-              <w:t>CUTOFF</w:t>
-            </w:r>
-          </w:p>
-        </w:tc>
-        <w:tc>
-          <w:tcPr>
-            <w:tcW w:type="dxa" w:w="3360"/>
-            <w:vAlign w:val="center"/>
-          </w:tcPr>
-          <w:p>
-            <w:r/>
-            <w:r>
-              <w:rPr>
-                <w:b w:val="0"/>
-                <w:sz w:val="18"/>
-              </w:rPr>
-              <w:t>None</w:t>
-            </w:r>
-          </w:p>
-        </w:tc>
-      </w:tr>
-      <w:tr>
-        <w:tc>
-          <w:tcPr>
-            <w:tcW w:type="dxa" w:w="3360"/>
-            <w:vAlign w:val="center"/>
-          </w:tcPr>
-          <w:p>
-            <w:r/>
-            <w:r>
-              <w:rPr>
-                <w:b w:val="0"/>
-                <w:sz w:val="18"/>
-              </w:rPr>
-              <w:t>3</w:t>
-            </w:r>
-          </w:p>
-        </w:tc>
-        <w:tc>
-          <w:tcPr>
-            <w:tcW w:type="dxa" w:w="3360"/>
-            <w:vAlign w:val="center"/>
-          </w:tcPr>
-          <w:p>
-            <w:r/>
-            <w:r>
-              <w:rPr>
-                <w:b w:val="0"/>
-                <w:sz w:val="18"/>
-              </w:rPr>
-              <w:t>FOUND</w:t>
-            </w:r>
-          </w:p>
-        </w:tc>
-        <w:tc>
-          <w:tcPr>
-            <w:tcW w:type="dxa" w:w="3360"/>
-            <w:vAlign w:val="center"/>
-          </w:tcPr>
-          <w:p>
-            <w:r/>
-            <w:r>
-              <w:rPr>
-                <w:b w:val="0"/>
-                <w:sz w:val="18"/>
-              </w:rPr>
-              <w:t>A → B → E → G</w:t>
-            </w:r>
-          </w:p>
-        </w:tc>
-      </w:tr>
-      <w:tr>
-        <w:tc>
-          <w:tcPr>
-            <w:tcW w:type="dxa" w:w="3360"/>
-            <w:vAlign w:val="center"/>
-          </w:tcPr>
-          <w:p>
-            <w:r/>
-            <w:r>
-              <w:rPr>
-                <w:b w:val="0"/>
-                <w:sz w:val="18"/>
-              </w:rPr>
-              <w:t>4</w:t>
-            </w:r>
-          </w:p>
-        </w:tc>
-        <w:tc>
-          <w:tcPr>
-            <w:tcW w:type="dxa" w:w="3360"/>
-            <w:vAlign w:val="center"/>
-          </w:tcPr>
-          <w:p>
-            <w:r/>
-            <w:r>
-              <w:rPr>
-                <w:b w:val="0"/>
-                <w:sz w:val="18"/>
-              </w:rPr>
-              <w:t>FOUND</w:t>
-            </w:r>
-          </w:p>
-        </w:tc>
-        <w:tc>
-          <w:tcPr>
-            <w:tcW w:type="dxa" w:w="3360"/>
-            <w:vAlign w:val="center"/>
-          </w:tcPr>
-          <w:p>
-            <w:r/>
-            <w:r>
-              <w:rPr>
-                <w:b w:val="0"/>
-                <w:sz w:val="18"/>
-              </w:rPr>
-              <w:t>A → B → E → G</w:t>
-            </w:r>
-          </w:p>
-        </w:tc>
-      </w:tr>
-    </w:tbl>
-    <w:p/>
-    <w:p>
-      <w:r>
-        <w:t>The root has depth 0. DLS returns CUTOFF when a deeper continuation exists at the limit and FAILURE when the branch is exhausted. IDDFS repeats depth-limited search with a fresh path-local cycle check; it reaches the goal at limit 3. The repeated work is the cost of obtaining the shallowest solution without storing the whole BFS frontier.</w:t>
-      </w:r>
-    </w:p>
-    <w:p>
-      <w:pPr>
-        <w:pStyle w:val="NoSpacing"/>
-      </w:pPr>
-      <w:r>
-        <w:rPr>
-          <w:rFonts w:ascii="Consolas" w:hAnsi="Consolas"/>
-          <w:sz w:val="17"/>
-        </w:rPr>
-        <w:t>BFS path: ['A', 'B', 'E', 'G']</w:t>
-        <w:br/>
-        <w:t>BFS visit order: ['A', 'B', 'C', 'D', 'E', 'F', 'G']</w:t>
-        <w:br/>
-        <w:t>1 processed A frontier []</w:t>
-        <w:br/>
-        <w:t>2 processed B frontier ['C']</w:t>
-        <w:br/>
-        <w:t>3 processed C frontier ['D', 'E']</w:t>
-        <w:br/>
-        <w:t>4 processed D frontier ['E', 'F']</w:t>
-        <w:br/>
-        <w:t>5 processed E frontier ['F']</w:t>
-        <w:br/>
-        <w:t>6 processed F frontier ['G']</w:t>
-        <w:br/>
-        <w:t>7 processed G frontier []</w:t>
-        <w:br/>
-        <w:t>DFS path: ['A', 'B', 'E', 'G']</w:t>
-        <w:br/>
-        <w:t>DFS visit order: ['A', 'B', 'D', 'E', 'G']</w:t>
-        <w:br/>
-        <w:t>1 processed A frontier []</w:t>
-        <w:br/>
-        <w:t>2 processed B frontier ['C']</w:t>
-        <w:br/>
-        <w:t>3 processed D frontier ['C', 'E']</w:t>
-        <w:br/>
-        <w:t>4 processed E frontier ['C']</w:t>
-        <w:br/>
-        <w:t>5 processed G frontier ['C']</w:t>
-        <w:br/>
-        <w:t>DLS 1 CUTOFF None visited ['A', 'B', 'C']</w:t>
-        <w:br/>
-        <w:t>DLS 2 CUTOFF None visited ['A', 'B', 'D', 'E', 'C', 'F']</w:t>
-        <w:br/>
-        <w:t>DLS 3 FOUND ['A', 'B', 'E', 'G'] visited ['A', 'B', 'D', 'E', 'G']</w:t>
-        <w:br/>
-        <w:t>DLS 4 FOUND ['A', 'B', 'E', 'G'] visited ['A', 'B', 'D', 'E', 'G']</w:t>
-        <w:br/>
-        <w:t>IDDFS 1 path None limits [(0, 'CUTOFF'), (1, 'CUTOFF')]</w:t>
-        <w:br/>
-        <w:t>IDDFS 2 path None limits [(0, 'CUTOFF'), (1, 'CUTOFF'), (2, 'CUTOFF')]</w:t>
-        <w:br/>
-        <w:t>IDDFS 3 path ['A', 'B', 'E', 'G'] limits [(0, 'CUTOFF'), (1, 'CUTOFF'), (2, 'CUTOFF'), (3, 'FOUND')]</w:t>
-        <w:br/>
-        <w:t>IDDFS 4 path ['A', 'B', 'E', 'G'] limits [(0, 'CUTOFF'), (1, 'CUTOFF'), (2, 'CUTOFF'), (3, 'FOUND')]</w:t>
-      </w:r>
-    </w:p>
-    <w:p>
-      <w:pPr>
-        <w:pStyle w:val="Heading1"/>
-      </w:pPr>
-      <w:r>
-        <w:t>4. Weighted graph and UCS</w:t>
-      </w:r>
-    </w:p>
-    <w:tbl>
-      <w:tblPr>
-        <w:tblStyle w:val="TableGrid"/>
-        <w:tblW w:type="auto" w:w="0"/>
-        <w:jc w:val="center"/>
-        <w:tblLook w:firstColumn="1" w:firstRow="1" w:lastColumn="0" w:lastRow="0" w:noHBand="0" w:noVBand="1" w:val="04A0"/>
-      </w:tblPr>
-      <w:tblGrid>
-        <w:gridCol w:w="5040"/>
-        <w:gridCol w:w="5040"/>
-      </w:tblGrid>
-      <w:tr>
-        <w:tc>
-          <w:tcPr>
-            <w:tcW w:type="dxa" w:w="5040"/>
-            <w:vAlign w:val="center"/>
-            <w:shd w:fill="D9EAF7"/>
-          </w:tcPr>
-          <w:p>
-            <w:r/>
-            <w:r>
-              <w:rPr>
-                <w:b/>
-                <w:sz w:val="18"/>
-              </w:rPr>
-              <w:t>Edge</w:t>
-            </w:r>
-          </w:p>
-        </w:tc>
-        <w:tc>
-          <w:tcPr>
-            <w:tcW w:type="dxa" w:w="5040"/>
-            <w:vAlign w:val="center"/>
-            <w:shd w:fill="D9EAF7"/>
-          </w:tcPr>
-          <w:p>
-            <w:r/>
-            <w:r>
-              <w:rPr>
-                <w:b/>
-                <w:sz w:val="18"/>
-              </w:rPr>
-              <w:t>Cost</w:t>
-            </w:r>
-          </w:p>
-        </w:tc>
-      </w:tr>
-      <w:tr>
-        <w:tc>
-          <w:tcPr>
-            <w:tcW w:type="dxa" w:w="5040"/>
-            <w:vAlign w:val="center"/>
-          </w:tcPr>
-          <w:p>
-            <w:r/>
-            <w:r>
-              <w:rPr>
-                <w:b w:val="0"/>
-                <w:sz w:val="18"/>
-              </w:rPr>
-              <w:t>A–B</w:t>
-            </w:r>
-          </w:p>
-        </w:tc>
-        <w:tc>
-          <w:tcPr>
-            <w:tcW w:type="dxa" w:w="5040"/>
-            <w:vAlign w:val="center"/>
-          </w:tcPr>
-          <w:p>
-            <w:r/>
-            <w:r>
-              <w:rPr>
-                <w:b w:val="0"/>
-                <w:sz w:val="18"/>
-              </w:rPr>
-              <w:t>1</w:t>
-            </w:r>
-          </w:p>
-        </w:tc>
-      </w:tr>
-      <w:tr>
-        <w:tc>
-          <w:tcPr>
-            <w:tcW w:type="dxa" w:w="5040"/>
-            <w:vAlign w:val="center"/>
-          </w:tcPr>
-          <w:p>
-            <w:r/>
-            <w:r>
-              <w:rPr>
-                <w:b w:val="0"/>
-                <w:sz w:val="18"/>
-              </w:rPr>
-              <w:t>B–D</w:t>
-            </w:r>
-          </w:p>
-        </w:tc>
-        <w:tc>
-          <w:tcPr>
-            <w:tcW w:type="dxa" w:w="5040"/>
-            <w:vAlign w:val="center"/>
-          </w:tcPr>
-          <w:p>
-            <w:r/>
-            <w:r>
-              <w:rPr>
-                <w:b w:val="0"/>
-                <w:sz w:val="18"/>
-              </w:rPr>
-              <w:t>1</w:t>
-            </w:r>
-          </w:p>
-        </w:tc>
-      </w:tr>
-      <w:tr>
-        <w:tc>
-          <w:tcPr>
-            <w:tcW w:type="dxa" w:w="5040"/>
-            <w:vAlign w:val="center"/>
-          </w:tcPr>
-          <w:p>
-            <w:r/>
-            <w:r>
-              <w:rPr>
-                <w:b w:val="0"/>
-                <w:sz w:val="18"/>
-              </w:rPr>
-              <w:t>B–E</w:t>
-            </w:r>
-          </w:p>
-        </w:tc>
-        <w:tc>
-          <w:tcPr>
-            <w:tcW w:type="dxa" w:w="5040"/>
-            <w:vAlign w:val="center"/>
-          </w:tcPr>
-          <w:p>
-            <w:r/>
-            <w:r>
-              <w:rPr>
-                <w:b w:val="0"/>
-                <w:sz w:val="18"/>
-              </w:rPr>
-              <w:t>1</w:t>
-            </w:r>
-          </w:p>
-        </w:tc>
-      </w:tr>
-      <w:tr>
-        <w:tc>
-          <w:tcPr>
-            <w:tcW w:type="dxa" w:w="5040"/>
-            <w:vAlign w:val="center"/>
-          </w:tcPr>
-          <w:p>
-            <w:r/>
-            <w:r>
-              <w:rPr>
-                <w:b w:val="0"/>
-                <w:sz w:val="18"/>
-              </w:rPr>
-              <w:t>E–G</w:t>
-            </w:r>
-          </w:p>
-        </w:tc>
-        <w:tc>
-          <w:tcPr>
-            <w:tcW w:type="dxa" w:w="5040"/>
-            <w:vAlign w:val="center"/>
-          </w:tcPr>
-          <w:p>
-            <w:r/>
-            <w:r>
-              <w:rPr>
-                <w:b w:val="0"/>
-                <w:sz w:val="18"/>
-              </w:rPr>
-              <w:t>1</w:t>
-            </w:r>
-          </w:p>
-        </w:tc>
-      </w:tr>
-      <w:tr>
-        <w:tc>
-          <w:tcPr>
-            <w:tcW w:type="dxa" w:w="5040"/>
-            <w:vAlign w:val="center"/>
-          </w:tcPr>
-          <w:p>
-            <w:r/>
-            <w:r>
-              <w:rPr>
-                <w:b w:val="0"/>
-                <w:sz w:val="18"/>
-              </w:rPr>
-              <w:t>A–C</w:t>
-            </w:r>
-          </w:p>
-        </w:tc>
-        <w:tc>
-          <w:tcPr>
-            <w:tcW w:type="dxa" w:w="5040"/>
-            <w:vAlign w:val="center"/>
-          </w:tcPr>
-          <w:p>
-            <w:r/>
-            <w:r>
-              <w:rPr>
-                <w:b w:val="0"/>
-                <w:sz w:val="18"/>
-              </w:rPr>
-              <w:t>5</w:t>
-            </w:r>
-          </w:p>
-        </w:tc>
-      </w:tr>
-      <w:tr>
-        <w:tc>
-          <w:tcPr>
-            <w:tcW w:type="dxa" w:w="5040"/>
-            <w:vAlign w:val="center"/>
-          </w:tcPr>
-          <w:p>
-            <w:r/>
-            <w:r>
-              <w:rPr>
-                <w:b w:val="0"/>
-                <w:sz w:val="18"/>
-              </w:rPr>
-              <w:t>C–F</w:t>
-            </w:r>
-          </w:p>
-        </w:tc>
-        <w:tc>
-          <w:tcPr>
-            <w:tcW w:type="dxa" w:w="5040"/>
-            <w:vAlign w:val="center"/>
-          </w:tcPr>
-          <w:p>
-            <w:r/>
-            <w:r>
-              <w:rPr>
-                <w:b w:val="0"/>
-                <w:sz w:val="18"/>
-              </w:rPr>
-              <w:t>1</w:t>
-            </w:r>
-          </w:p>
-        </w:tc>
-      </w:tr>
-      <w:tr>
-        <w:tc>
-          <w:tcPr>
-            <w:tcW w:type="dxa" w:w="5040"/>
-            <w:vAlign w:val="center"/>
-          </w:tcPr>
-          <w:p>
-            <w:r/>
-            <w:r>
-              <w:rPr>
-                <w:b w:val="0"/>
-                <w:sz w:val="18"/>
-              </w:rPr>
-              <w:t>C–G</w:t>
-            </w:r>
-          </w:p>
-        </w:tc>
-        <w:tc>
-          <w:tcPr>
-            <w:tcW w:type="dxa" w:w="5040"/>
-            <w:vAlign w:val="center"/>
-          </w:tcPr>
-          <w:p>
-            <w:r/>
-            <w:r>
-              <w:rPr>
-                <w:b w:val="0"/>
-                <w:sz w:val="18"/>
-              </w:rPr>
-              <w:t>7</w:t>
-            </w:r>
-          </w:p>
-        </w:tc>
-      </w:tr>
-    </w:tbl>
-    <w:p/>
-    <w:p>
-      <w:r>
-        <w:t>The extension adds C → G. BFS chooses A → C → G because it has two edges, with cost 5 + 7 = 12. UCS chooses A → B → E → G, with three edges and cost 1 + 1 + 1 = 3. Thus fewest hops and lowest cost are different objectives.</w:t>
-      </w:r>
-    </w:p>
-    <w:p>
-      <w:pPr>
-        <w:pStyle w:val="NoSpacing"/>
-      </w:pPr>
-      <w:r>
-        <w:rPr>
-          <w:rFonts w:ascii="Consolas" w:hAnsi="Consolas"/>
-          <w:sz w:val="17"/>
-        </w:rPr>
-        <w:t>BFS path: ['A', 'B', 'E', 'G']</w:t>
-        <w:br/>
-        <w:t>BFS visit order: ['A', 'B', 'C', 'D', 'E', 'F', 'G']</w:t>
-        <w:br/>
-        <w:t>1 processed A frontier []</w:t>
-        <w:br/>
-        <w:t>2 processed B frontier ['C']</w:t>
-        <w:br/>
-        <w:t>3 processed C frontier ['D', 'E']</w:t>
-        <w:br/>
-        <w:t>4 processed D frontier ['E', 'F']</w:t>
-        <w:br/>
-        <w:t>5 processed E frontier ['F']</w:t>
-        <w:br/>
-        <w:t>6 processed F frontier ['G']</w:t>
-        <w:br/>
-        <w:t>7 processed G frontier []</w:t>
-        <w:br/>
-        <w:t>DFS path: ['A', 'B', 'E', 'G']</w:t>
-        <w:br/>
-        <w:t>DFS visit order: ['A', 'B', 'D', 'E', 'G']</w:t>
-        <w:br/>
-        <w:t>1 processed A frontier []</w:t>
-        <w:br/>
-        <w:t>2 processed B frontier ['C']</w:t>
-        <w:br/>
-        <w:t>3 processed D frontier ['C', 'E']</w:t>
-        <w:br/>
-        <w:t>4 processed E frontier ['C']</w:t>
-        <w:br/>
-        <w:t>5 processed G frontier ['C']</w:t>
-        <w:br/>
-        <w:t>weights {('A', 'B'): 1, ('B', 'D'): 1, ('B', 'E'): 1, ('C', 'F'): 1, ('E', 'G'): 1, ('A', 'C'): 5, ('C', 'G'): 7}</w:t>
-        <w:br/>
-        <w:t>BFS path ['A', 'C', 'G'] hops 2 cost 12</w:t>
-        <w:br/>
-        <w:t>UCS path ['A', 'B', 'E', 'G'] hops 3 cost 3</w:t>
-        <w:br/>
-        <w:t>UCS processed [('A', 0), ('B', 1), ('D', 2), ('E', 2), ('G', 3)]</w:t>
-        <w:br/>
-        <w:t>UCS independently summed cost 3</w:t>
-      </w:r>
-    </w:p>
-    <w:p>
-      <w:pPr>
-        <w:pStyle w:val="Heading1"/>
-      </w:pPr>
-      <w:r>
-        <w:t>5. Edge cases and limitations</w:t>
-      </w:r>
-    </w:p>
-    <w:p>
-      <w:r>
-        <w:t>The implementations include start-equals-goal naturally: the first processed node is the answer. An unreachable goal returns None after the reachable component is exhausted. Path-local cycle checks prevent infinite recursion in DLS/IDDFS, while BFS/DFS use explored tracking. UCS assumes non-negative costs; negative edges would require a different method. Search counts include the goal when it is processed.</w:t>
-      </w:r>
-    </w:p>
-    <w:p>
-      <w:pPr>
-        <w:pStyle w:val="Heading1"/>
-      </w:pPr>
-      <w:r>
-        <w:t>6. Complexity comparison</w:t>
-      </w:r>
-    </w:p>
-    <w:tbl>
-      <w:tblPr>
-        <w:tblStyle w:val="TableGrid"/>
-        <w:tblW w:type="auto" w:w="0"/>
-        <w:jc w:val="center"/>
-        <w:tblLook w:firstColumn="1" w:firstRow="1" w:lastColumn="0" w:lastRow="0" w:noHBand="0" w:noVBand="1" w:val="04A0"/>
-      </w:tblPr>
-      <w:tblGrid>
-        <w:gridCol w:w="2520"/>
-        <w:gridCol w:w="2520"/>
-        <w:gridCol w:w="2520"/>
-        <w:gridCol w:w="2520"/>
-      </w:tblGrid>
-      <w:tr>
-        <w:tc>
-          <w:tcPr>
-            <w:tcW w:type="dxa" w:w="2520"/>
-            <w:vAlign w:val="center"/>
-            <w:shd w:fill="D9EAF7"/>
-          </w:tcPr>
-          <w:p>
-            <w:r/>
-            <w:r>
-              <w:rPr>
-                <w:b/>
-                <w:sz w:val="18"/>
-              </w:rPr>
-              <w:t>Strategy</w:t>
-            </w:r>
-          </w:p>
-        </w:tc>
-        <w:tc>
-          <w:tcPr>
-            <w:tcW w:type="dxa" w:w="2520"/>
-            <w:vAlign w:val="center"/>
-            <w:shd w:fill="D9EAF7"/>
-          </w:tcPr>
-          <w:p>
-            <w:r/>
-            <w:r>
-              <w:rPr>
-                <w:b/>
-                <w:sz w:val="18"/>
-              </w:rPr>
-              <w:t>Complete?</w:t>
-            </w:r>
-          </w:p>
-        </w:tc>
-        <w:tc>
-          <w:tcPr>
-            <w:tcW w:type="dxa" w:w="2520"/>
-            <w:vAlign w:val="center"/>
-            <w:shd w:fill="D9EAF7"/>
-          </w:tcPr>
-          <w:p>
-            <w:r/>
-            <w:r>
-              <w:rPr>
-                <w:b/>
-                <w:sz w:val="18"/>
-              </w:rPr>
-              <w:t>Optimal?</w:t>
-            </w:r>
-          </w:p>
-        </w:tc>
-        <w:tc>
-          <w:tcPr>
-            <w:tcW w:type="dxa" w:w="2520"/>
-            <w:vAlign w:val="center"/>
-            <w:shd w:fill="D9EAF7"/>
-          </w:tcPr>
-          <w:p>
-            <w:r/>
-            <w:r>
-              <w:rPr>
-                <w:b/>
-                <w:sz w:val="18"/>
-              </w:rPr>
-              <w:t>Main resource behaviour</w:t>
-            </w:r>
-          </w:p>
-        </w:tc>
-      </w:tr>
-      <w:tr>
-        <w:tc>
-          <w:tcPr>
-            <w:tcW w:type="dxa" w:w="2520"/>
-            <w:vAlign w:val="center"/>
-          </w:tcPr>
-          <w:p>
-            <w:r/>
-            <w:r>
-              <w:rPr>
-                <w:b w:val="0"/>
-                <w:sz w:val="18"/>
-              </w:rPr>
-              <w:t>BFS</w:t>
-            </w:r>
-          </w:p>
-        </w:tc>
-        <w:tc>
-          <w:tcPr>
-            <w:tcW w:type="dxa" w:w="2520"/>
-            <w:vAlign w:val="center"/>
-          </w:tcPr>
-          <w:p>
-            <w:r/>
-            <w:r>
-              <w:rPr>
-                <w:b w:val="0"/>
-                <w:sz w:val="18"/>
-              </w:rPr>
-              <w:t>Yes for finite branching</w:t>
-            </w:r>
-          </w:p>
-        </w:tc>
-        <w:tc>
-          <w:tcPr>
-            <w:tcW w:type="dxa" w:w="2520"/>
-            <w:vAlign w:val="center"/>
-          </w:tcPr>
-          <w:p>
-            <w:r/>
-            <w:r>
-              <w:rPr>
-                <w:b w:val="0"/>
-                <w:sz w:val="18"/>
-              </w:rPr>
-              <w:t>Yes for equal step cost</w:t>
-            </w:r>
-          </w:p>
-        </w:tc>
-        <w:tc>
-          <w:tcPr>
-            <w:tcW w:type="dxa" w:w="2520"/>
-            <w:vAlign w:val="center"/>
-          </w:tcPr>
-          <w:p>
-            <w:r/>
-            <w:r>
-              <w:rPr>
-                <w:b w:val="0"/>
-                <w:sz w:val="18"/>
-              </w:rPr>
-              <w:t>High memory at broad depths</w:t>
-            </w:r>
-          </w:p>
-        </w:tc>
-      </w:tr>
-      <w:tr>
-        <w:tc>
-          <w:tcPr>
-            <w:tcW w:type="dxa" w:w="2520"/>
-            <w:vAlign w:val="center"/>
-          </w:tcPr>
-          <w:p>
-            <w:r/>
-            <w:r>
-              <w:rPr>
-                <w:b w:val="0"/>
-                <w:sz w:val="18"/>
-              </w:rPr>
-              <w:t>DFS</w:t>
-            </w:r>
-          </w:p>
-        </w:tc>
-        <w:tc>
-          <w:tcPr>
-            <w:tcW w:type="dxa" w:w="2520"/>
-            <w:vAlign w:val="center"/>
-          </w:tcPr>
-          <w:p>
-            <w:r/>
-            <w:r>
-              <w:rPr>
-                <w:b w:val="0"/>
-                <w:sz w:val="18"/>
-              </w:rPr>
-              <w:t>Not always</w:t>
-            </w:r>
-          </w:p>
-        </w:tc>
-        <w:tc>
-          <w:tcPr>
-            <w:tcW w:type="dxa" w:w="2520"/>
-            <w:vAlign w:val="center"/>
-          </w:tcPr>
-          <w:p>
-            <w:r/>
-            <w:r>
-              <w:rPr>
-                <w:b w:val="0"/>
-                <w:sz w:val="18"/>
-              </w:rPr>
-              <w:t>No</w:t>
-            </w:r>
-          </w:p>
-        </w:tc>
-        <w:tc>
-          <w:tcPr>
-            <w:tcW w:type="dxa" w:w="2520"/>
-            <w:vAlign w:val="center"/>
-          </w:tcPr>
-          <w:p>
-            <w:r/>
-            <w:r>
-              <w:rPr>
-                <w:b w:val="0"/>
-                <w:sz w:val="18"/>
-              </w:rPr>
-              <w:t>Low memory but can go deep</w:t>
-            </w:r>
-          </w:p>
-        </w:tc>
-      </w:tr>
-      <w:tr>
-        <w:tc>
-          <w:tcPr>
-            <w:tcW w:type="dxa" w:w="2520"/>
-            <w:vAlign w:val="center"/>
-          </w:tcPr>
-          <w:p>
-            <w:r/>
-            <w:r>
-              <w:rPr>
-                <w:b w:val="0"/>
-                <w:sz w:val="18"/>
-              </w:rPr>
-              <w:t>DLS</w:t>
-            </w:r>
-          </w:p>
-        </w:tc>
-        <w:tc>
-          <w:tcPr>
-            <w:tcW w:type="dxa" w:w="2520"/>
-            <w:vAlign w:val="center"/>
-          </w:tcPr>
-          <w:p>
-            <w:r/>
-            <w:r>
-              <w:rPr>
-                <w:b w:val="0"/>
-                <w:sz w:val="18"/>
-              </w:rPr>
-              <w:t>If limit is sufficient</w:t>
-            </w:r>
-          </w:p>
-        </w:tc>
-        <w:tc>
-          <w:tcPr>
-            <w:tcW w:type="dxa" w:w="2520"/>
-            <w:vAlign w:val="center"/>
-          </w:tcPr>
-          <w:p>
-            <w:r/>
-            <w:r>
-              <w:rPr>
-                <w:b w:val="0"/>
-                <w:sz w:val="18"/>
-              </w:rPr>
-              <w:t>No</w:t>
-            </w:r>
-          </w:p>
-        </w:tc>
-        <w:tc>
-          <w:tcPr>
-            <w:tcW w:type="dxa" w:w="2520"/>
-            <w:vAlign w:val="center"/>
-          </w:tcPr>
-          <w:p>
-            <w:r/>
-            <w:r>
-              <w:rPr>
-                <w:b w:val="0"/>
-                <w:sz w:val="18"/>
-              </w:rPr>
-              <w:t>Depth bounded</w:t>
-            </w:r>
-          </w:p>
-        </w:tc>
-      </w:tr>
-      <w:tr>
-        <w:tc>
-          <w:tcPr>
-            <w:tcW w:type="dxa" w:w="2520"/>
-            <w:vAlign w:val="center"/>
-          </w:tcPr>
-          <w:p>
-            <w:r/>
-            <w:r>
-              <w:rPr>
-                <w:b w:val="0"/>
-                <w:sz w:val="18"/>
-              </w:rPr>
-              <w:t>IDDFS</w:t>
-            </w:r>
-          </w:p>
-        </w:tc>
-        <w:tc>
-          <w:tcPr>
-            <w:tcW w:type="dxa" w:w="2520"/>
-            <w:vAlign w:val="center"/>
-          </w:tcPr>
-          <w:p>
-            <w:r/>
-            <w:r>
-              <w:rPr>
-                <w:b w:val="0"/>
-                <w:sz w:val="18"/>
-              </w:rPr>
-              <w:t>Yes</w:t>
-            </w:r>
-          </w:p>
-        </w:tc>
-        <w:tc>
-          <w:tcPr>
-            <w:tcW w:type="dxa" w:w="2520"/>
-            <w:vAlign w:val="center"/>
-          </w:tcPr>
-          <w:p>
-            <w:r/>
-            <w:r>
-              <w:rPr>
-                <w:b w:val="0"/>
-                <w:sz w:val="18"/>
-              </w:rPr>
-              <w:t>Yes for equal step cost</w:t>
-            </w:r>
-          </w:p>
-        </w:tc>
-        <w:tc>
-          <w:tcPr>
-            <w:tcW w:type="dxa" w:w="2520"/>
-            <w:vAlign w:val="center"/>
-          </w:tcPr>
-          <w:p>
-            <w:r/>
-            <w:r>
-              <w:rPr>
-                <w:b w:val="0"/>
-                <w:sz w:val="18"/>
-              </w:rPr>
-              <w:t>Repeated shallow work</w:t>
-            </w:r>
-          </w:p>
-        </w:tc>
-      </w:tr>
-      <w:tr>
-        <w:tc>
-          <w:tcPr>
-            <w:tcW w:type="dxa" w:w="2520"/>
-            <w:vAlign w:val="center"/>
-          </w:tcPr>
-          <w:p>
-            <w:r/>
-            <w:r>
-              <w:rPr>
-                <w:b w:val="0"/>
-                <w:sz w:val="18"/>
-              </w:rPr>
-              <w:t>UCS</w:t>
-            </w:r>
-          </w:p>
-        </w:tc>
-        <w:tc>
-          <w:tcPr>
-            <w:tcW w:type="dxa" w:w="2520"/>
-            <w:vAlign w:val="center"/>
-          </w:tcPr>
-          <w:p>
-            <w:r/>
-            <w:r>
-              <w:rPr>
-                <w:b w:val="0"/>
-                <w:sz w:val="18"/>
-              </w:rPr>
-              <w:t>Yes with positive costs</w:t>
-            </w:r>
-          </w:p>
-        </w:tc>
-        <w:tc>
-          <w:tcPr>
-            <w:tcW w:type="dxa" w:w="2520"/>
-            <w:vAlign w:val="center"/>
-          </w:tcPr>
-          <w:p>
-            <w:r/>
-            <w:r>
-              <w:rPr>
-                <w:b w:val="0"/>
-                <w:sz w:val="18"/>
-              </w:rPr>
-              <w:t>Yes</w:t>
-            </w:r>
-          </w:p>
-        </w:tc>
-        <w:tc>
-          <w:tcPr>
-            <w:tcW w:type="dxa" w:w="2520"/>
-            <w:vAlign w:val="center"/>
-          </w:tcPr>
-          <w:p>
-            <w:r/>
-            <w:r>
-              <w:rPr>
-                <w:b w:val="0"/>
-                <w:sz w:val="18"/>
-              </w:rPr>
-              <w:t>Priority queue ordered by path cost</w:t>
-            </w:r>
-          </w:p>
-        </w:tc>
-      </w:tr>
-    </w:tbl>
-    <w:p/>
-    <w:p>
-      <w:pPr>
-        <w:pStyle w:val="Heading1"/>
-      </w:pPr>
-      <w:r>
-        <w:t>7. Reflection and responsible practice</w:t>
-      </w:r>
-    </w:p>
-    <w:p>
-      <w:r>
-        <w:t>I learned that a returned path is not enough evidence; the expansion order and cost must also be recorded. DFS looked efficient on this small graph because it reached the goal early, but that result should not be generalised. In a rescue system, the route policy must state whether time, energy, risk or distance is being optimised, and testing must include cycles, unreachable goals and changing edge costs.</w:t>
-      </w:r>
-    </w:p>
-    <w:p>
-      <w:pPr>
-        <w:pStyle w:val="Heading1"/>
-      </w:pPr>
-      <w:r>
-        <w:t>8. Sources</w:t>
-      </w:r>
-    </w:p>
-    <w:p>
-      <w:pPr>
-        <w:pStyle w:val="ListBullet"/>
-      </w:pPr>
-      <w:r>
-        <w:t>Russell, S. and Norvig, P., Artificial Intelligence: A Modern Approach, 4th ed., chapters on uninformed search. https://aima.cs.berkeley.edu/</w:t>
-      </w:r>
-    </w:p>
-    <w:p>
-      <w:pPr>
-        <w:pStyle w:val="ListBullet"/>
-      </w:pPr>
-      <w:r>
-        <w:t>Course lab manual, CAI601400, Section 3.2 BFS/DFS, Section 3.3 DLS/IDDFS/UCS, and Section 3.7 weighted corridor extension (provided PDF).</w:t>
+        <w:t>Muhammad Ahmad, Roll No. 395 — In Lab 3 I wrote one Python program containing BFS, DFS, depth-limited search, iterative deepening and uniform-cost search for the supplied graph, then added edge weights to show why the cheapest route can differ from the route with the fewest hops. The main problems were keeping the successor order consistent, stopping searches safely when a goal was unreachable, and preventing repeated states from causing loops, so I used queues, stacks, recursion limits, visited sets and a priority queue with recorded path costs.</w:t>
       </w:r>
     </w:p>
     <w:sectPr>
       <w:pgSz w:w="12240" w:h="15840"/>
-      <w:pgMar w:top="1008" w:right="1080" w:bottom="1008" w:left="1080" w:header="720" w:footer="720" w:gutter="0"/>
+      <w:pgMar w:top="1440" w:right="1800" w:bottom="1440" w:left="1800" w:header="720" w:footer="720" w:gutter="0"/>
       <w:cols w:space="720"/>
       <w:docGrid w:linePitch="360"/>
     </w:sectPr>
@@ -1813,10 +387,6 @@
     <w:name w:val="Normal"/>
     <w:qFormat/>
     <w:rsid w:val="00FC693F"/>
-    <w:rPr>
-      <w:rFonts w:ascii="Calibri" w:hAnsi="Calibri"/>
-      <w:sz w:val="21"/>
-    </w:rPr>
   </w:style>
   <w:style w:type="paragraph" w:styleId="Header">
     <w:name w:val="header"/>
@@ -1877,11 +447,11 @@
       <w:outlineLvl w:val="0"/>
     </w:pPr>
     <w:rPr>
-      <w:rFonts w:asciiTheme="majorHAnsi" w:eastAsiaTheme="majorEastAsia" w:hAnsiTheme="majorHAnsi" w:cstheme="majorBidi" w:ascii="Calibri" w:hAnsi="Calibri"/>
+      <w:rFonts w:asciiTheme="majorHAnsi" w:eastAsiaTheme="majorEastAsia" w:hAnsiTheme="majorHAnsi" w:cstheme="majorBidi"/>
       <w:b/>
       <w:bCs/>
-      <w:color w:val="1F4E79"/>
-      <w:sz w:val="36"/>
+      <w:color w:val="365F91" w:themeColor="accent1" w:themeShade="BF"/>
+      <w:sz w:val="28"/>
       <w:szCs w:val="28"/>
     </w:rPr>
   </w:style>
@@ -1901,10 +471,10 @@
       <w:outlineLvl w:val="1"/>
     </w:pPr>
     <w:rPr>
-      <w:rFonts w:asciiTheme="majorHAnsi" w:eastAsiaTheme="majorEastAsia" w:hAnsiTheme="majorHAnsi" w:cstheme="majorBidi" w:ascii="Calibri" w:hAnsi="Calibri"/>
+      <w:rFonts w:asciiTheme="majorHAnsi" w:eastAsiaTheme="majorEastAsia" w:hAnsiTheme="majorHAnsi" w:cstheme="majorBidi"/>
       <w:b/>
       <w:bCs/>
-      <w:color w:val="2F5496"/>
+      <w:color w:val="4F81BD" w:themeColor="accent1"/>
       <w:sz w:val="26"/>
       <w:szCs w:val="26"/>
     </w:rPr>

</xml_diff>

<commit_message>
Rebuild Lab 3 according to manual
</commit_message>
<xml_diff>
--- a/Lab-3/Lab3_Report.docx
+++ b/Lab-3/Lab3_Report.docx
@@ -4,19 +4,1646 @@
   <w:body>
     <w:p>
       <w:pPr>
-        <w:jc w:val="both"/>
+        <w:jc w:val="center"/>
       </w:pPr>
       <w:r>
         <w:rPr>
-          <w:rFonts w:ascii="Calibri" w:hAnsi="Calibri"/>
-          <w:sz w:val="22"/>
+          <w:b w:val="0"/>
+          <w:i w:val="0"/>
         </w:rPr>
-        <w:t>Muhammad Ahmad, Roll No. 395 — In Lab 3 I wrote one Python program containing BFS, DFS, depth-limited search, iterative deepening and uniform-cost search for the supplied graph, then added edge weights to show why the cheapest route can differ from the route with the fewest hops. The main problems were keeping the successor order consistent, stopping searches safely when a goal was unreachable, and preventing repeated states from causing loops, so I used queues, stacks, recursion limits, visited sets and a priority queue with recorded path costs.</w:t>
+        <w:t>CAI601400 — Artificial Intelligence Lab</w:t>
+      </w:r>
+    </w:p>
+    <w:p>
+      <w:pPr>
+        <w:jc w:val="center"/>
+      </w:pPr>
+      <w:r>
+        <w:rPr>
+          <w:b/>
+          <w:i w:val="0"/>
+        </w:rPr>
+        <w:t>Lab 3 Report: Uninformed Search</w:t>
+      </w:r>
+    </w:p>
+    <w:p>
+      <w:pPr>
+        <w:jc w:val="center"/>
+      </w:pPr>
+      <w:r>
+        <w:rPr>
+          <w:b w:val="0"/>
+          <w:i/>
+        </w:rPr>
+        <w:t>BFS, DFS, DLS, IDDFS and UCS on an Emergency-Exit Graph</w:t>
+      </w:r>
+    </w:p>
+    <w:p>
+      <w:pPr>
+        <w:jc w:val="center"/>
+      </w:pPr>
+      <w:r>
+        <w:rPr>
+          <w:b w:val="0"/>
+          <w:i w:val="0"/>
+        </w:rPr>
+        <w:t>Student: Muhammad Ahmad | Roll No.: 395</w:t>
+      </w:r>
+    </w:p>
+    <w:p>
+      <w:r>
+        <w:rPr>
+          <w:b w:val="0"/>
+          <w:i w:val="0"/>
+        </w:rPr>
+      </w:r>
+    </w:p>
+    <w:p>
+      <w:r>
+        <w:rPr>
+          <w:b/>
+          <w:i w:val="0"/>
+        </w:rPr>
+        <w:t>1. Objective and Problem Formulation</w:t>
+      </w:r>
+    </w:p>
+    <w:p>
+      <w:r>
+        <w:rPr>
+          <w:b w:val="0"/>
+          <w:i w:val="0"/>
+        </w:rPr>
+        <w:t>This lab applies uninformed search to a small emergency-exit graph. The objective is to formulate the state space, implement BFS and DFS from scratch, apply depth-limited and iterative-deepening search, and use uniform-cost search on a weighted extension. The results are reported from the actual program trace; no expansion order was changed to match a predicted answer.</w:t>
+      </w:r>
+    </w:p>
+    <w:tbl>
+      <w:tblPr>
+        <w:tblStyle w:val="TableGrid"/>
+        <w:tblW w:type="auto" w:w="0"/>
+        <w:jc w:val="center"/>
+        <w:tblLook w:firstColumn="1" w:firstRow="1" w:lastColumn="0" w:lastRow="0" w:noHBand="0" w:noVBand="1" w:val="04A0"/>
+      </w:tblPr>
+      <w:tblGrid>
+        <w:gridCol w:w="5112"/>
+        <w:gridCol w:w="5112"/>
+      </w:tblGrid>
+      <w:tr>
+        <w:tc>
+          <w:tcPr>
+            <w:tcW w:type="dxa" w:w="5112"/>
+            <w:shd w:fill="5B1A7A"/>
+            <w:vAlign w:val="center"/>
+          </w:tcPr>
+          <w:p>
+            <w:r>
+              <w:rPr>
+                <w:b/>
+                <w:color w:val="FFFFFF"/>
+              </w:rPr>
+              <w:t>Element</w:t>
+            </w:r>
+          </w:p>
+        </w:tc>
+        <w:tc>
+          <w:tcPr>
+            <w:tcW w:type="dxa" w:w="5112"/>
+            <w:shd w:fill="5B1A7A"/>
+            <w:vAlign w:val="center"/>
+          </w:tcPr>
+          <w:p>
+            <w:r>
+              <w:rPr>
+                <w:b/>
+                <w:color w:val="FFFFFF"/>
+              </w:rPr>
+              <w:t>Formulation</w:t>
+            </w:r>
+          </w:p>
+        </w:tc>
+      </w:tr>
+      <w:tr>
+        <w:tc>
+          <w:tcPr>
+            <w:tcW w:type="dxa" w:w="5112"/>
+          </w:tcPr>
+          <w:p>
+            <w:r>
+              <w:t>States</w:t>
+            </w:r>
+          </w:p>
+        </w:tc>
+        <w:tc>
+          <w:tcPr>
+            <w:tcW w:type="dxa" w:w="5112"/>
+          </w:tcPr>
+          <w:p>
+            <w:r>
+              <w:t>A, B, C, D, E, F, G</w:t>
+            </w:r>
+          </w:p>
+        </w:tc>
+      </w:tr>
+      <w:tr>
+        <w:tc>
+          <w:tcPr>
+            <w:tcW w:type="dxa" w:w="5112"/>
+          </w:tcPr>
+          <w:p>
+            <w:r>
+              <w:t>Initial state</w:t>
+            </w:r>
+          </w:p>
+        </w:tc>
+        <w:tc>
+          <w:tcPr>
+            <w:tcW w:type="dxa" w:w="5112"/>
+          </w:tcPr>
+          <w:p>
+            <w:r>
+              <w:t>A</w:t>
+            </w:r>
+          </w:p>
+        </w:tc>
+      </w:tr>
+      <w:tr>
+        <w:tc>
+          <w:tcPr>
+            <w:tcW w:type="dxa" w:w="5112"/>
+          </w:tcPr>
+          <w:p>
+            <w:r>
+              <w:t>Goal test</w:t>
+            </w:r>
+          </w:p>
+        </w:tc>
+        <w:tc>
+          <w:tcPr>
+            <w:tcW w:type="dxa" w:w="5112"/>
+          </w:tcPr>
+          <w:p>
+            <w:r>
+              <w:t>current node == G</w:t>
+            </w:r>
+          </w:p>
+        </w:tc>
+      </w:tr>
+      <w:tr>
+        <w:tc>
+          <w:tcPr>
+            <w:tcW w:type="dxa" w:w="5112"/>
+          </w:tcPr>
+          <w:p>
+            <w:r>
+              <w:t>Actions</w:t>
+            </w:r>
+          </w:p>
+        </w:tc>
+        <w:tc>
+          <w:tcPr>
+            <w:tcW w:type="dxa" w:w="5112"/>
+          </w:tcPr>
+          <w:p>
+            <w:r>
+              <w:t>Move along a directed successor edge</w:t>
+            </w:r>
+          </w:p>
+        </w:tc>
+      </w:tr>
+      <w:tr>
+        <w:tc>
+          <w:tcPr>
+            <w:tcW w:type="dxa" w:w="5112"/>
+          </w:tcPr>
+          <w:p>
+            <w:r>
+              <w:t>Path cost</w:t>
+            </w:r>
+          </w:p>
+        </w:tc>
+        <w:tc>
+          <w:tcPr>
+            <w:tcW w:type="dxa" w:w="5112"/>
+          </w:tcPr>
+          <w:p>
+            <w:r>
+              <w:t>1 per edge in the original graph; explicit positive weights in the extension</w:t>
+            </w:r>
+          </w:p>
+        </w:tc>
+      </w:tr>
+    </w:tbl>
+    <w:p>
+      <w:r>
+        <w:rPr>
+          <w:b/>
+          <w:i w:val="0"/>
+        </w:rPr>
+        <w:t>2. Graph and Reproducibility</w:t>
+      </w:r>
+    </w:p>
+    <w:p>
+      <w:pPr>
+        <w:pStyle w:val="NoSpacing"/>
+        <w:ind w:left="288"/>
+      </w:pPr>
+      <w:r>
+        <w:rPr>
+          <w:rFonts w:ascii="Consolas" w:hAnsi="Consolas"/>
+          <w:sz w:val="16"/>
+        </w:rPr>
+        <w:t>A -&gt; B, C</w:t>
+        <w:br/>
+        <w:t>B -&gt; D, E</w:t>
+        <w:br/>
+        <w:t>C -&gt; F</w:t>
+        <w:br/>
+        <w:t>E -&gt; G</w:t>
+        <w:br/>
+        <w:t>D, F, G have no successors</w:t>
+      </w:r>
+    </w:p>
+    <w:p>
+      <w:r>
+        <w:rPr>
+          <w:b w:val="0"/>
+          <w:i w:val="0"/>
+        </w:rPr>
+        <w:t>The successor order is fixed left-to-right. For the weighted extension, C -&gt; G is added as an alternative corridor with weights A-B=1, B-D=1, B-E=1, E-G=1, A-C=5, C-F=1 and C-G=7. The code is self-contained and uses only Python standard-library modules.</w:t>
+      </w:r>
+    </w:p>
+    <w:p>
+      <w:r>
+        <w:rPr>
+          <w:b/>
+          <w:i w:val="0"/>
+        </w:rPr>
+        <w:t>3. Implementation Choices</w:t>
+      </w:r>
+    </w:p>
+    <w:tbl>
+      <w:tblPr>
+        <w:tblStyle w:val="TableGrid"/>
+        <w:tblW w:type="auto" w:w="0"/>
+        <w:jc w:val="center"/>
+        <w:tblLook w:firstColumn="1" w:firstRow="1" w:lastColumn="0" w:lastRow="0" w:noHBand="0" w:noVBand="1" w:val="04A0"/>
+      </w:tblPr>
+      <w:tblGrid>
+        <w:gridCol w:w="3408"/>
+        <w:gridCol w:w="3408"/>
+        <w:gridCol w:w="3408"/>
+      </w:tblGrid>
+      <w:tr>
+        <w:tc>
+          <w:tcPr>
+            <w:tcW w:type="dxa" w:w="3408"/>
+            <w:shd w:fill="5B1A7A"/>
+            <w:vAlign w:val="center"/>
+          </w:tcPr>
+          <w:p>
+            <w:r>
+              <w:rPr>
+                <w:b/>
+                <w:color w:val="FFFFFF"/>
+              </w:rPr>
+              <w:t>Algorithm</w:t>
+            </w:r>
+          </w:p>
+        </w:tc>
+        <w:tc>
+          <w:tcPr>
+            <w:tcW w:type="dxa" w:w="3408"/>
+            <w:shd w:fill="5B1A7A"/>
+            <w:vAlign w:val="center"/>
+          </w:tcPr>
+          <w:p>
+            <w:r>
+              <w:rPr>
+                <w:b/>
+                <w:color w:val="FFFFFF"/>
+              </w:rPr>
+              <w:t>Frontier / rule</w:t>
+            </w:r>
+          </w:p>
+        </w:tc>
+        <w:tc>
+          <w:tcPr>
+            <w:tcW w:type="dxa" w:w="3408"/>
+            <w:shd w:fill="5B1A7A"/>
+            <w:vAlign w:val="center"/>
+          </w:tcPr>
+          <w:p>
+            <w:r>
+              <w:rPr>
+                <w:b/>
+                <w:color w:val="FFFFFF"/>
+              </w:rPr>
+              <w:t>Expected property</w:t>
+            </w:r>
+          </w:p>
+        </w:tc>
+      </w:tr>
+      <w:tr>
+        <w:tc>
+          <w:tcPr>
+            <w:tcW w:type="dxa" w:w="3408"/>
+          </w:tcPr>
+          <w:p>
+            <w:r>
+              <w:t>BFS</w:t>
+            </w:r>
+          </w:p>
+        </w:tc>
+        <w:tc>
+          <w:tcPr>
+            <w:tcW w:type="dxa" w:w="3408"/>
+          </w:tcPr>
+          <w:p>
+            <w:r>
+              <w:t>FIFO queue; mark a node when enqueued</w:t>
+            </w:r>
+          </w:p>
+        </w:tc>
+        <w:tc>
+          <w:tcPr>
+            <w:tcW w:type="dxa" w:w="3408"/>
+          </w:tcPr>
+          <w:p>
+            <w:r>
+              <w:t>Complete on finite branching; shortest in number of edges</w:t>
+            </w:r>
+          </w:p>
+        </w:tc>
+      </w:tr>
+      <w:tr>
+        <w:tc>
+          <w:tcPr>
+            <w:tcW w:type="dxa" w:w="3408"/>
+          </w:tcPr>
+          <w:p>
+            <w:r>
+              <w:t>DFS</w:t>
+            </w:r>
+          </w:p>
+        </w:tc>
+        <w:tc>
+          <w:tcPr>
+            <w:tcW w:type="dxa" w:w="3408"/>
+          </w:tcPr>
+          <w:p>
+            <w:r>
+              <w:t>LIFO stack; push reversed successors to preserve left-to-right order</w:t>
+            </w:r>
+          </w:p>
+        </w:tc>
+        <w:tc>
+          <w:tcPr>
+            <w:tcW w:type="dxa" w:w="3408"/>
+          </w:tcPr>
+          <w:p>
+            <w:r>
+              <w:t>Can reach deep branches; not generally optimal</w:t>
+            </w:r>
+          </w:p>
+        </w:tc>
+      </w:tr>
+      <w:tr>
+        <w:tc>
+          <w:tcPr>
+            <w:tcW w:type="dxa" w:w="3408"/>
+          </w:tcPr>
+          <w:p>
+            <w:r>
+              <w:t>DLS</w:t>
+            </w:r>
+          </w:p>
+        </w:tc>
+        <w:tc>
+          <w:tcPr>
+            <w:tcW w:type="dxa" w:w="3408"/>
+          </w:tcPr>
+          <w:p>
+            <w:r>
+              <w:t>DFS with a depth limit and path-local cycle check</w:t>
+            </w:r>
+          </w:p>
+        </w:tc>
+        <w:tc>
+          <w:tcPr>
+            <w:tcW w:type="dxa" w:w="3408"/>
+          </w:tcPr>
+          <w:p>
+            <w:r>
+              <w:t>Returns FOUND, CUTOFF, or FAILURE</w:t>
+            </w:r>
+          </w:p>
+        </w:tc>
+      </w:tr>
+      <w:tr>
+        <w:tc>
+          <w:tcPr>
+            <w:tcW w:type="dxa" w:w="3408"/>
+          </w:tcPr>
+          <w:p>
+            <w:r>
+              <w:t>IDDFS</w:t>
+            </w:r>
+          </w:p>
+        </w:tc>
+        <w:tc>
+          <w:tcPr>
+            <w:tcW w:type="dxa" w:w="3408"/>
+          </w:tcPr>
+          <w:p>
+            <w:r>
+              <w:t>Fresh DLS passes at limits 0, 1, 2, ...</w:t>
+            </w:r>
+          </w:p>
+        </w:tc>
+        <w:tc>
+          <w:tcPr>
+            <w:tcW w:type="dxa" w:w="3408"/>
+          </w:tcPr>
+          <w:p>
+            <w:r>
+              <w:t>Finds the shallowest goal while using bounded DFS memory</w:t>
+            </w:r>
+          </w:p>
+        </w:tc>
+      </w:tr>
+      <w:tr>
+        <w:tc>
+          <w:tcPr>
+            <w:tcW w:type="dxa" w:w="3408"/>
+          </w:tcPr>
+          <w:p>
+            <w:r>
+              <w:t>UCS</w:t>
+            </w:r>
+          </w:p>
+        </w:tc>
+        <w:tc>
+          <w:tcPr>
+            <w:tcW w:type="dxa" w:w="3408"/>
+          </w:tcPr>
+          <w:p>
+            <w:r>
+              <w:t>Priority queue ordered by accumulated path cost</w:t>
+            </w:r>
+          </w:p>
+        </w:tc>
+        <w:tc>
+          <w:tcPr>
+            <w:tcW w:type="dxa" w:w="3408"/>
+          </w:tcPr>
+          <w:p>
+            <w:r>
+              <w:t>Optimal for positive edge costs</w:t>
+            </w:r>
+          </w:p>
+        </w:tc>
+      </w:tr>
+    </w:tbl>
+    <w:p>
+      <w:r>
+        <w:rPr>
+          <w:b/>
+          <w:i w:val="0"/>
+        </w:rPr>
+        <w:t>4. BFS and DFS Results</w:t>
+      </w:r>
+    </w:p>
+    <w:tbl>
+      <w:tblPr>
+        <w:tblStyle w:val="TableGrid"/>
+        <w:tblW w:type="auto" w:w="0"/>
+        <w:jc w:val="center"/>
+        <w:tblLook w:firstColumn="1" w:firstRow="1" w:lastColumn="0" w:lastRow="0" w:noHBand="0" w:noVBand="1" w:val="04A0"/>
+      </w:tblPr>
+      <w:tblGrid>
+        <w:gridCol w:w="2556"/>
+        <w:gridCol w:w="2556"/>
+        <w:gridCol w:w="2556"/>
+        <w:gridCol w:w="2556"/>
+      </w:tblGrid>
+      <w:tr>
+        <w:tc>
+          <w:tcPr>
+            <w:tcW w:type="dxa" w:w="2556"/>
+            <w:shd w:fill="5B1A7A"/>
+            <w:vAlign w:val="center"/>
+          </w:tcPr>
+          <w:p>
+            <w:r>
+              <w:rPr>
+                <w:b/>
+                <w:color w:val="FFFFFF"/>
+              </w:rPr>
+              <w:t>Search</w:t>
+            </w:r>
+          </w:p>
+        </w:tc>
+        <w:tc>
+          <w:tcPr>
+            <w:tcW w:type="dxa" w:w="2556"/>
+            <w:shd w:fill="5B1A7A"/>
+            <w:vAlign w:val="center"/>
+          </w:tcPr>
+          <w:p>
+            <w:r>
+              <w:rPr>
+                <w:b/>
+                <w:color w:val="FFFFFF"/>
+              </w:rPr>
+              <w:t>Returned path</w:t>
+            </w:r>
+          </w:p>
+        </w:tc>
+        <w:tc>
+          <w:tcPr>
+            <w:tcW w:type="dxa" w:w="2556"/>
+            <w:shd w:fill="5B1A7A"/>
+            <w:vAlign w:val="center"/>
+          </w:tcPr>
+          <w:p>
+            <w:r>
+              <w:rPr>
+                <w:b/>
+                <w:color w:val="FFFFFF"/>
+              </w:rPr>
+              <w:t>Edges</w:t>
+            </w:r>
+          </w:p>
+        </w:tc>
+        <w:tc>
+          <w:tcPr>
+            <w:tcW w:type="dxa" w:w="2556"/>
+            <w:shd w:fill="5B1A7A"/>
+            <w:vAlign w:val="center"/>
+          </w:tcPr>
+          <w:p>
+            <w:r>
+              <w:rPr>
+                <w:b/>
+                <w:color w:val="FFFFFF"/>
+              </w:rPr>
+              <w:t>Expansion order</w:t>
+            </w:r>
+          </w:p>
+        </w:tc>
+      </w:tr>
+      <w:tr>
+        <w:tc>
+          <w:tcPr>
+            <w:tcW w:type="dxa" w:w="2556"/>
+          </w:tcPr>
+          <w:p>
+            <w:r>
+              <w:t>BFS</w:t>
+            </w:r>
+          </w:p>
+        </w:tc>
+        <w:tc>
+          <w:tcPr>
+            <w:tcW w:type="dxa" w:w="2556"/>
+          </w:tcPr>
+          <w:p>
+            <w:r>
+              <w:t>A → B → E → G</w:t>
+            </w:r>
+          </w:p>
+        </w:tc>
+        <w:tc>
+          <w:tcPr>
+            <w:tcW w:type="dxa" w:w="2556"/>
+          </w:tcPr>
+          <w:p>
+            <w:r>
+              <w:t>3</w:t>
+            </w:r>
+          </w:p>
+        </w:tc>
+        <w:tc>
+          <w:tcPr>
+            <w:tcW w:type="dxa" w:w="2556"/>
+          </w:tcPr>
+          <w:p>
+            <w:r>
+              <w:t>A, B, C, D, E, G</w:t>
+            </w:r>
+          </w:p>
+        </w:tc>
+      </w:tr>
+      <w:tr>
+        <w:tc>
+          <w:tcPr>
+            <w:tcW w:type="dxa" w:w="2556"/>
+          </w:tcPr>
+          <w:p>
+            <w:r>
+              <w:t>DFS</w:t>
+            </w:r>
+          </w:p>
+        </w:tc>
+        <w:tc>
+          <w:tcPr>
+            <w:tcW w:type="dxa" w:w="2556"/>
+          </w:tcPr>
+          <w:p>
+            <w:r>
+              <w:t>A → B → E → G</w:t>
+            </w:r>
+          </w:p>
+        </w:tc>
+        <w:tc>
+          <w:tcPr>
+            <w:tcW w:type="dxa" w:w="2556"/>
+          </w:tcPr>
+          <w:p>
+            <w:r>
+              <w:t>3</w:t>
+            </w:r>
+          </w:p>
+        </w:tc>
+        <w:tc>
+          <w:tcPr>
+            <w:tcW w:type="dxa" w:w="2556"/>
+          </w:tcPr>
+          <w:p>
+            <w:r>
+              <w:t>A, B, D, E, G</w:t>
+            </w:r>
+          </w:p>
+        </w:tc>
+      </w:tr>
+    </w:tbl>
+    <w:p>
+      <w:r>
+        <w:rPr>
+          <w:b w:val="0"/>
+          <w:i w:val="0"/>
+        </w:rPr>
+        <w:t>Both searches return the same path on the supplied unweighted graph, but their traces differ: DFS explores the dead-end D before moving to E, whereas BFS processes the frontier level by level.</w:t>
+      </w:r>
+    </w:p>
+    <w:p>
+      <w:r>
+        <w:rPr>
+          <w:b/>
+          <w:i w:val="0"/>
+        </w:rPr>
+        <w:t>5. DLS and IDDFS Results</w:t>
+      </w:r>
+    </w:p>
+    <w:tbl>
+      <w:tblPr>
+        <w:tblStyle w:val="TableGrid"/>
+        <w:tblW w:type="auto" w:w="0"/>
+        <w:jc w:val="center"/>
+        <w:tblLook w:firstColumn="1" w:firstRow="1" w:lastColumn="0" w:lastRow="0" w:noHBand="0" w:noVBand="1" w:val="04A0"/>
+      </w:tblPr>
+      <w:tblGrid>
+        <w:gridCol w:w="2556"/>
+        <w:gridCol w:w="2556"/>
+        <w:gridCol w:w="2556"/>
+        <w:gridCol w:w="2556"/>
+      </w:tblGrid>
+      <w:tr>
+        <w:tc>
+          <w:tcPr>
+            <w:tcW w:type="dxa" w:w="2556"/>
+            <w:shd w:fill="5B1A7A"/>
+            <w:vAlign w:val="center"/>
+          </w:tcPr>
+          <w:p>
+            <w:r>
+              <w:rPr>
+                <w:b/>
+                <w:color w:val="FFFFFF"/>
+              </w:rPr>
+              <w:t>Limit / pass</w:t>
+            </w:r>
+          </w:p>
+        </w:tc>
+        <w:tc>
+          <w:tcPr>
+            <w:tcW w:type="dxa" w:w="2556"/>
+            <w:shd w:fill="5B1A7A"/>
+            <w:vAlign w:val="center"/>
+          </w:tcPr>
+          <w:p>
+            <w:r>
+              <w:rPr>
+                <w:b/>
+                <w:color w:val="FFFFFF"/>
+              </w:rPr>
+              <w:t>Status</w:t>
+            </w:r>
+          </w:p>
+        </w:tc>
+        <w:tc>
+          <w:tcPr>
+            <w:tcW w:type="dxa" w:w="2556"/>
+            <w:shd w:fill="5B1A7A"/>
+            <w:vAlign w:val="center"/>
+          </w:tcPr>
+          <w:p>
+            <w:r>
+              <w:rPr>
+                <w:b/>
+                <w:color w:val="FFFFFF"/>
+              </w:rPr>
+              <w:t>Path</w:t>
+            </w:r>
+          </w:p>
+        </w:tc>
+        <w:tc>
+          <w:tcPr>
+            <w:tcW w:type="dxa" w:w="2556"/>
+            <w:shd w:fill="5B1A7A"/>
+            <w:vAlign w:val="center"/>
+          </w:tcPr>
+          <w:p>
+            <w:r>
+              <w:rPr>
+                <w:b/>
+                <w:color w:val="FFFFFF"/>
+              </w:rPr>
+              <w:t>Expansion order</w:t>
+            </w:r>
+          </w:p>
+        </w:tc>
+      </w:tr>
+      <w:tr>
+        <w:tc>
+          <w:tcPr>
+            <w:tcW w:type="dxa" w:w="2556"/>
+          </w:tcPr>
+          <w:p>
+            <w:r>
+              <w:t>DLS 1</w:t>
+            </w:r>
+          </w:p>
+        </w:tc>
+        <w:tc>
+          <w:tcPr>
+            <w:tcW w:type="dxa" w:w="2556"/>
+          </w:tcPr>
+          <w:p>
+            <w:r>
+              <w:t>CUTOFF</w:t>
+            </w:r>
+          </w:p>
+        </w:tc>
+        <w:tc>
+          <w:tcPr>
+            <w:tcW w:type="dxa" w:w="2556"/>
+          </w:tcPr>
+          <w:p>
+            <w:r>
+              <w:t>—</w:t>
+            </w:r>
+          </w:p>
+        </w:tc>
+        <w:tc>
+          <w:tcPr>
+            <w:tcW w:type="dxa" w:w="2556"/>
+          </w:tcPr>
+          <w:p>
+            <w:r>
+              <w:t>A, B, C</w:t>
+            </w:r>
+          </w:p>
+        </w:tc>
+      </w:tr>
+      <w:tr>
+        <w:tc>
+          <w:tcPr>
+            <w:tcW w:type="dxa" w:w="2556"/>
+          </w:tcPr>
+          <w:p>
+            <w:r>
+              <w:t>DLS 2</w:t>
+            </w:r>
+          </w:p>
+        </w:tc>
+        <w:tc>
+          <w:tcPr>
+            <w:tcW w:type="dxa" w:w="2556"/>
+          </w:tcPr>
+          <w:p>
+            <w:r>
+              <w:t>CUTOFF</w:t>
+            </w:r>
+          </w:p>
+        </w:tc>
+        <w:tc>
+          <w:tcPr>
+            <w:tcW w:type="dxa" w:w="2556"/>
+          </w:tcPr>
+          <w:p>
+            <w:r>
+              <w:t>—</w:t>
+            </w:r>
+          </w:p>
+        </w:tc>
+        <w:tc>
+          <w:tcPr>
+            <w:tcW w:type="dxa" w:w="2556"/>
+          </w:tcPr>
+          <w:p>
+            <w:r>
+              <w:t>A, B, D, E, C, F</w:t>
+            </w:r>
+          </w:p>
+        </w:tc>
+      </w:tr>
+      <w:tr>
+        <w:tc>
+          <w:tcPr>
+            <w:tcW w:type="dxa" w:w="2556"/>
+          </w:tcPr>
+          <w:p>
+            <w:r>
+              <w:t>DLS 3</w:t>
+            </w:r>
+          </w:p>
+        </w:tc>
+        <w:tc>
+          <w:tcPr>
+            <w:tcW w:type="dxa" w:w="2556"/>
+          </w:tcPr>
+          <w:p>
+            <w:r>
+              <w:t>FOUND</w:t>
+            </w:r>
+          </w:p>
+        </w:tc>
+        <w:tc>
+          <w:tcPr>
+            <w:tcW w:type="dxa" w:w="2556"/>
+          </w:tcPr>
+          <w:p>
+            <w:r>
+              <w:t>A → B → E → G</w:t>
+            </w:r>
+          </w:p>
+        </w:tc>
+        <w:tc>
+          <w:tcPr>
+            <w:tcW w:type="dxa" w:w="2556"/>
+          </w:tcPr>
+          <w:p>
+            <w:r>
+              <w:t>A, B, D, E, G</w:t>
+            </w:r>
+          </w:p>
+        </w:tc>
+      </w:tr>
+      <w:tr>
+        <w:tc>
+          <w:tcPr>
+            <w:tcW w:type="dxa" w:w="2556"/>
+          </w:tcPr>
+          <w:p>
+            <w:r>
+              <w:t>DLS 4</w:t>
+            </w:r>
+          </w:p>
+        </w:tc>
+        <w:tc>
+          <w:tcPr>
+            <w:tcW w:type="dxa" w:w="2556"/>
+          </w:tcPr>
+          <w:p>
+            <w:r>
+              <w:t>FOUND</w:t>
+            </w:r>
+          </w:p>
+        </w:tc>
+        <w:tc>
+          <w:tcPr>
+            <w:tcW w:type="dxa" w:w="2556"/>
+          </w:tcPr>
+          <w:p>
+            <w:r>
+              <w:t>A → B → E → G</w:t>
+            </w:r>
+          </w:p>
+        </w:tc>
+        <w:tc>
+          <w:tcPr>
+            <w:tcW w:type="dxa" w:w="2556"/>
+          </w:tcPr>
+          <w:p>
+            <w:r>
+              <w:t>A, B, D, E, G</w:t>
+            </w:r>
+          </w:p>
+        </w:tc>
+      </w:tr>
+      <w:tr>
+        <w:tc>
+          <w:tcPr>
+            <w:tcW w:type="dxa" w:w="2556"/>
+          </w:tcPr>
+          <w:p>
+            <w:r>
+              <w:t>IDDFS 0</w:t>
+            </w:r>
+          </w:p>
+        </w:tc>
+        <w:tc>
+          <w:tcPr>
+            <w:tcW w:type="dxa" w:w="2556"/>
+          </w:tcPr>
+          <w:p>
+            <w:r>
+              <w:t>CUTOFF</w:t>
+            </w:r>
+          </w:p>
+        </w:tc>
+        <w:tc>
+          <w:tcPr>
+            <w:tcW w:type="dxa" w:w="2556"/>
+          </w:tcPr>
+          <w:p>
+            <w:r>
+              <w:t>—</w:t>
+            </w:r>
+          </w:p>
+        </w:tc>
+        <w:tc>
+          <w:tcPr>
+            <w:tcW w:type="dxa" w:w="2556"/>
+          </w:tcPr>
+          <w:p>
+            <w:r>
+              <w:t>A</w:t>
+            </w:r>
+          </w:p>
+        </w:tc>
+      </w:tr>
+      <w:tr>
+        <w:tc>
+          <w:tcPr>
+            <w:tcW w:type="dxa" w:w="2556"/>
+          </w:tcPr>
+          <w:p>
+            <w:r>
+              <w:t>IDDFS 1</w:t>
+            </w:r>
+          </w:p>
+        </w:tc>
+        <w:tc>
+          <w:tcPr>
+            <w:tcW w:type="dxa" w:w="2556"/>
+          </w:tcPr>
+          <w:p>
+            <w:r>
+              <w:t>CUTOFF</w:t>
+            </w:r>
+          </w:p>
+        </w:tc>
+        <w:tc>
+          <w:tcPr>
+            <w:tcW w:type="dxa" w:w="2556"/>
+          </w:tcPr>
+          <w:p>
+            <w:r>
+              <w:t>—</w:t>
+            </w:r>
+          </w:p>
+        </w:tc>
+        <w:tc>
+          <w:tcPr>
+            <w:tcW w:type="dxa" w:w="2556"/>
+          </w:tcPr>
+          <w:p>
+            <w:r>
+              <w:t>A, B, C</w:t>
+            </w:r>
+          </w:p>
+        </w:tc>
+      </w:tr>
+      <w:tr>
+        <w:tc>
+          <w:tcPr>
+            <w:tcW w:type="dxa" w:w="2556"/>
+          </w:tcPr>
+          <w:p>
+            <w:r>
+              <w:t>IDDFS 2</w:t>
+            </w:r>
+          </w:p>
+        </w:tc>
+        <w:tc>
+          <w:tcPr>
+            <w:tcW w:type="dxa" w:w="2556"/>
+          </w:tcPr>
+          <w:p>
+            <w:r>
+              <w:t>CUTOFF</w:t>
+            </w:r>
+          </w:p>
+        </w:tc>
+        <w:tc>
+          <w:tcPr>
+            <w:tcW w:type="dxa" w:w="2556"/>
+          </w:tcPr>
+          <w:p>
+            <w:r>
+              <w:t>—</w:t>
+            </w:r>
+          </w:p>
+        </w:tc>
+        <w:tc>
+          <w:tcPr>
+            <w:tcW w:type="dxa" w:w="2556"/>
+          </w:tcPr>
+          <w:p>
+            <w:r>
+              <w:t>A, B, D, E, C, F</w:t>
+            </w:r>
+          </w:p>
+        </w:tc>
+      </w:tr>
+      <w:tr>
+        <w:tc>
+          <w:tcPr>
+            <w:tcW w:type="dxa" w:w="2556"/>
+          </w:tcPr>
+          <w:p>
+            <w:r>
+              <w:t>IDDFS 3</w:t>
+            </w:r>
+          </w:p>
+        </w:tc>
+        <w:tc>
+          <w:tcPr>
+            <w:tcW w:type="dxa" w:w="2556"/>
+          </w:tcPr>
+          <w:p>
+            <w:r>
+              <w:t>FOUND</w:t>
+            </w:r>
+          </w:p>
+        </w:tc>
+        <w:tc>
+          <w:tcPr>
+            <w:tcW w:type="dxa" w:w="2556"/>
+          </w:tcPr>
+          <w:p>
+            <w:r>
+              <w:t>A → B → E → G</w:t>
+            </w:r>
+          </w:p>
+        </w:tc>
+        <w:tc>
+          <w:tcPr>
+            <w:tcW w:type="dxa" w:w="2556"/>
+          </w:tcPr>
+          <w:p>
+            <w:r>
+              <w:t>A, B, D, E, G</w:t>
+            </w:r>
+          </w:p>
+        </w:tc>
+      </w:tr>
+    </w:tbl>
+    <w:p>
+      <w:r>
+        <w:rPr>
+          <w:b w:val="0"/>
+          <w:i w:val="0"/>
+        </w:rPr>
+        <w:t>The goal is at depth 3. Therefore limits 1 and 2 cannot reach G and correctly report CUTOFF, while limit 3 succeeds. IDDFS repeats earlier work deliberately so it can discover the shallowest solution without retaining a broad BFS frontier.</w:t>
+      </w:r>
+    </w:p>
+    <w:p>
+      <w:r>
+        <w:rPr>
+          <w:b/>
+          <w:i w:val="0"/>
+        </w:rPr>
+        <w:t>6. Weighted Extension and UCS</w:t>
+      </w:r>
+    </w:p>
+    <w:tbl>
+      <w:tblPr>
+        <w:tblStyle w:val="TableGrid"/>
+        <w:tblW w:type="auto" w:w="0"/>
+        <w:jc w:val="center"/>
+        <w:tblLook w:firstColumn="1" w:firstRow="1" w:lastColumn="0" w:lastRow="0" w:noHBand="0" w:noVBand="1" w:val="04A0"/>
+      </w:tblPr>
+      <w:tblGrid>
+        <w:gridCol w:w="2045"/>
+        <w:gridCol w:w="2045"/>
+        <w:gridCol w:w="2045"/>
+        <w:gridCol w:w="2045"/>
+        <w:gridCol w:w="2045"/>
+      </w:tblGrid>
+      <w:tr>
+        <w:tc>
+          <w:tcPr>
+            <w:tcW w:type="dxa" w:w="2045"/>
+            <w:shd w:fill="5B1A7A"/>
+            <w:vAlign w:val="center"/>
+          </w:tcPr>
+          <w:p>
+            <w:r>
+              <w:rPr>
+                <w:b/>
+                <w:color w:val="FFFFFF"/>
+              </w:rPr>
+              <w:t>Search</w:t>
+            </w:r>
+          </w:p>
+        </w:tc>
+        <w:tc>
+          <w:tcPr>
+            <w:tcW w:type="dxa" w:w="2045"/>
+            <w:shd w:fill="5B1A7A"/>
+            <w:vAlign w:val="center"/>
+          </w:tcPr>
+          <w:p>
+            <w:r>
+              <w:rPr>
+                <w:b/>
+                <w:color w:val="FFFFFF"/>
+              </w:rPr>
+              <w:t>Returned path</w:t>
+            </w:r>
+          </w:p>
+        </w:tc>
+        <w:tc>
+          <w:tcPr>
+            <w:tcW w:type="dxa" w:w="2045"/>
+            <w:shd w:fill="5B1A7A"/>
+            <w:vAlign w:val="center"/>
+          </w:tcPr>
+          <w:p>
+            <w:r>
+              <w:rPr>
+                <w:b/>
+                <w:color w:val="FFFFFF"/>
+              </w:rPr>
+              <w:t>Edges</w:t>
+            </w:r>
+          </w:p>
+        </w:tc>
+        <w:tc>
+          <w:tcPr>
+            <w:tcW w:type="dxa" w:w="2045"/>
+            <w:shd w:fill="5B1A7A"/>
+            <w:vAlign w:val="center"/>
+          </w:tcPr>
+          <w:p>
+            <w:r>
+              <w:rPr>
+                <w:b/>
+                <w:color w:val="FFFFFF"/>
+              </w:rPr>
+              <w:t>Cost</w:t>
+            </w:r>
+          </w:p>
+        </w:tc>
+        <w:tc>
+          <w:tcPr>
+            <w:tcW w:type="dxa" w:w="2045"/>
+            <w:shd w:fill="5B1A7A"/>
+            <w:vAlign w:val="center"/>
+          </w:tcPr>
+          <w:p>
+            <w:r>
+              <w:rPr>
+                <w:b/>
+                <w:color w:val="FFFFFF"/>
+              </w:rPr>
+              <w:t>Expansion order</w:t>
+            </w:r>
+          </w:p>
+        </w:tc>
+      </w:tr>
+      <w:tr>
+        <w:tc>
+          <w:tcPr>
+            <w:tcW w:type="dxa" w:w="2045"/>
+          </w:tcPr>
+          <w:p>
+            <w:r>
+              <w:t>BFS on weighted graph</w:t>
+            </w:r>
+          </w:p>
+        </w:tc>
+        <w:tc>
+          <w:tcPr>
+            <w:tcW w:type="dxa" w:w="2045"/>
+          </w:tcPr>
+          <w:p>
+            <w:r>
+              <w:t>A → C → G</w:t>
+            </w:r>
+          </w:p>
+        </w:tc>
+        <w:tc>
+          <w:tcPr>
+            <w:tcW w:type="dxa" w:w="2045"/>
+          </w:tcPr>
+          <w:p>
+            <w:r>
+              <w:t>2</w:t>
+            </w:r>
+          </w:p>
+        </w:tc>
+        <w:tc>
+          <w:tcPr>
+            <w:tcW w:type="dxa" w:w="2045"/>
+          </w:tcPr>
+          <w:p>
+            <w:r>
+              <w:t>12</w:t>
+            </w:r>
+          </w:p>
+        </w:tc>
+        <w:tc>
+          <w:tcPr>
+            <w:tcW w:type="dxa" w:w="2045"/>
+          </w:tcPr>
+          <w:p>
+            <w:r>
+              <w:t>A, B, C, D, E, F, G</w:t>
+            </w:r>
+          </w:p>
+        </w:tc>
+      </w:tr>
+      <w:tr>
+        <w:tc>
+          <w:tcPr>
+            <w:tcW w:type="dxa" w:w="2045"/>
+          </w:tcPr>
+          <w:p>
+            <w:r>
+              <w:t>UCS</w:t>
+            </w:r>
+          </w:p>
+        </w:tc>
+        <w:tc>
+          <w:tcPr>
+            <w:tcW w:type="dxa" w:w="2045"/>
+          </w:tcPr>
+          <w:p>
+            <w:r>
+              <w:t>A → B → E → G</w:t>
+            </w:r>
+          </w:p>
+        </w:tc>
+        <w:tc>
+          <w:tcPr>
+            <w:tcW w:type="dxa" w:w="2045"/>
+          </w:tcPr>
+          <w:p>
+            <w:r>
+              <w:t>3</w:t>
+            </w:r>
+          </w:p>
+        </w:tc>
+        <w:tc>
+          <w:tcPr>
+            <w:tcW w:type="dxa" w:w="2045"/>
+          </w:tcPr>
+          <w:p>
+            <w:r>
+              <w:t>3</w:t>
+            </w:r>
+          </w:p>
+        </w:tc>
+        <w:tc>
+          <w:tcPr>
+            <w:tcW w:type="dxa" w:w="2045"/>
+          </w:tcPr>
+          <w:p>
+            <w:r>
+              <w:t>A(0), B(1), D(2), E(2), G(3)</w:t>
+            </w:r>
+          </w:p>
+        </w:tc>
+      </w:tr>
+    </w:tbl>
+    <w:p>
+      <w:r>
+        <w:rPr>
+          <w:b w:val="0"/>
+          <w:i w:val="0"/>
+        </w:rPr>
+        <w:t>This is the required comparison: BFS prefers the route with fewer edges, A-C-G, but its cost is 5 + 7 = 12. UCS prefers A-B-E-G because its total cost is 1 + 1 + 1 = 3, even though it contains one more edge. All weights are positive, so UCS is appropriate.</w:t>
+      </w:r>
+    </w:p>
+    <w:p>
+      <w:r>
+        <w:rPr>
+          <w:b/>
+          <w:i w:val="0"/>
+        </w:rPr>
+        <w:t>7. Testing, Edge Cases and Interpretation</w:t>
+      </w:r>
+    </w:p>
+    <w:tbl>
+      <w:tblPr>
+        <w:tblStyle w:val="TableGrid"/>
+        <w:tblW w:type="auto" w:w="0"/>
+        <w:jc w:val="center"/>
+        <w:tblLook w:firstColumn="1" w:firstRow="1" w:lastColumn="0" w:lastRow="0" w:noHBand="0" w:noVBand="1" w:val="04A0"/>
+      </w:tblPr>
+      <w:tblGrid>
+        <w:gridCol w:w="3408"/>
+        <w:gridCol w:w="3408"/>
+        <w:gridCol w:w="3408"/>
+      </w:tblGrid>
+      <w:tr>
+        <w:tc>
+          <w:tcPr>
+            <w:tcW w:type="dxa" w:w="3408"/>
+            <w:shd w:fill="5B1A7A"/>
+            <w:vAlign w:val="center"/>
+          </w:tcPr>
+          <w:p>
+            <w:r>
+              <w:rPr>
+                <w:b/>
+                <w:color w:val="FFFFFF"/>
+              </w:rPr>
+              <w:t>Test</w:t>
+            </w:r>
+          </w:p>
+        </w:tc>
+        <w:tc>
+          <w:tcPr>
+            <w:tcW w:type="dxa" w:w="3408"/>
+            <w:shd w:fill="5B1A7A"/>
+            <w:vAlign w:val="center"/>
+          </w:tcPr>
+          <w:p>
+            <w:r>
+              <w:rPr>
+                <w:b/>
+                <w:color w:val="FFFFFF"/>
+              </w:rPr>
+              <w:t>Observed result</w:t>
+            </w:r>
+          </w:p>
+        </w:tc>
+        <w:tc>
+          <w:tcPr>
+            <w:tcW w:type="dxa" w:w="3408"/>
+            <w:shd w:fill="5B1A7A"/>
+            <w:vAlign w:val="center"/>
+          </w:tcPr>
+          <w:p>
+            <w:r>
+              <w:rPr>
+                <w:b/>
+                <w:color w:val="FFFFFF"/>
+              </w:rPr>
+              <w:t>Interpretation</w:t>
+            </w:r>
+          </w:p>
+        </w:tc>
+      </w:tr>
+      <w:tr>
+        <w:tc>
+          <w:tcPr>
+            <w:tcW w:type="dxa" w:w="3408"/>
+          </w:tcPr>
+          <w:p>
+            <w:r>
+              <w:t>BFS(A, Z)</w:t>
+            </w:r>
+          </w:p>
+        </w:tc>
+        <w:tc>
+          <w:tcPr>
+            <w:tcW w:type="dxa" w:w="3408"/>
+          </w:tcPr>
+          <w:p>
+            <w:r>
+              <w:t>(None, [A, B, C, D, E, F, G])</w:t>
+            </w:r>
+          </w:p>
+        </w:tc>
+        <w:tc>
+          <w:tcPr>
+            <w:tcW w:type="dxa" w:w="3408"/>
+          </w:tcPr>
+          <w:p>
+            <w:r>
+              <w:t>Unreachable goal terminates safely</w:t>
+            </w:r>
+          </w:p>
+        </w:tc>
+      </w:tr>
+      <w:tr>
+        <w:tc>
+          <w:tcPr>
+            <w:tcW w:type="dxa" w:w="3408"/>
+          </w:tcPr>
+          <w:p>
+            <w:r>
+              <w:t>DLS(A, Z, 4)</w:t>
+            </w:r>
+          </w:p>
+        </w:tc>
+        <w:tc>
+          <w:tcPr>
+            <w:tcW w:type="dxa" w:w="3408"/>
+          </w:tcPr>
+          <w:p>
+            <w:r>
+              <w:t>FAILURE with finite trace</w:t>
+            </w:r>
+          </w:p>
+        </w:tc>
+        <w:tc>
+          <w:tcPr>
+            <w:tcW w:type="dxa" w:w="3408"/>
+          </w:tcPr>
+          <w:p>
+            <w:r>
+              <w:t>No remaining cutoff means the goal is not in the explored graph</w:t>
+            </w:r>
+          </w:p>
+        </w:tc>
+      </w:tr>
+      <w:tr>
+        <w:tc>
+          <w:tcPr>
+            <w:tcW w:type="dxa" w:w="3408"/>
+          </w:tcPr>
+          <w:p>
+            <w:r>
+              <w:t>DFS on A → B → A cycle and B → G</w:t>
+            </w:r>
+          </w:p>
+        </w:tc>
+        <w:tc>
+          <w:tcPr>
+            <w:tcW w:type="dxa" w:w="3408"/>
+          </w:tcPr>
+          <w:p>
+            <w:r>
+              <w:t>A → B → G</w:t>
+            </w:r>
+          </w:p>
+        </w:tc>
+        <w:tc>
+          <w:tcPr>
+            <w:tcW w:type="dxa" w:w="3408"/>
+          </w:tcPr>
+          <w:p>
+            <w:r>
+              <w:t>Path-local / visited checks prevent infinite repetition</w:t>
+            </w:r>
+          </w:p>
+        </w:tc>
+      </w:tr>
+      <w:tr>
+        <w:tc>
+          <w:tcPr>
+            <w:tcW w:type="dxa" w:w="3408"/>
+          </w:tcPr>
+          <w:p>
+            <w:r>
+              <w:t>DLS(A, G, 2)</w:t>
+            </w:r>
+          </w:p>
+        </w:tc>
+        <w:tc>
+          <w:tcPr>
+            <w:tcW w:type="dxa" w:w="3408"/>
+          </w:tcPr>
+          <w:p>
+            <w:r>
+              <w:t>CUTOFF</w:t>
+            </w:r>
+          </w:p>
+        </w:tc>
+        <w:tc>
+          <w:tcPr>
+            <w:tcW w:type="dxa" w:w="3408"/>
+          </w:tcPr>
+          <w:p>
+            <w:r>
+              <w:t>A bounded-depth failure is not proof that G is unreachable</w:t>
+            </w:r>
+          </w:p>
+        </w:tc>
+      </w:tr>
+    </w:tbl>
+    <w:p>
+      <w:r>
+        <w:rPr>
+          <w:b w:val="0"/>
+          <w:i w:val="0"/>
+        </w:rPr>
+        <w:t>A practical failure mode is confusing CUTOFF with FAILURE: a limit that is too small only proves that the goal was not found within the bound. Another failure mode is using BFS when travel costs matter; the weighted experiment demonstrates why the algorithm must match the objective.</w:t>
+      </w:r>
+    </w:p>
+    <w:p>
+      <w:r>
+        <w:rPr>
+          <w:b/>
+          <w:i w:val="0"/>
+        </w:rPr>
+        <w:t>8. Reflection and Viva Notes</w:t>
+      </w:r>
+    </w:p>
+    <w:p>
+      <w:r>
+        <w:rPr>
+          <w:b w:val="0"/>
+          <w:i w:val="0"/>
+        </w:rPr>
+        <w:t>• What I learned: frontier discipline determines the search trace, while the path-cost rule determines whether UCS chooses a route BFS would reject.</w:t>
+      </w:r>
+    </w:p>
+    <w:p>
+      <w:r>
+        <w:rPr>
+          <w:b w:val="0"/>
+          <w:i w:val="0"/>
+        </w:rPr>
+        <w:t>• Application: a rescue robot can use BFS when every move has equal cost, DLS when a depth budget is important, and UCS when corridors have different travel costs.</w:t>
+      </w:r>
+    </w:p>
+    <w:p>
+      <w:r>
+        <w:rPr>
+          <w:b w:val="0"/>
+          <w:i w:val="0"/>
+        </w:rPr>
+        <w:t>• What surprised me: the two-edge BFS route can be much more expensive than the three-edge UCS route.</w:t>
+      </w:r>
+    </w:p>
+    <w:p>
+      <w:r>
+        <w:rPr>
+          <w:b w:val="0"/>
+          <w:i w:val="0"/>
+        </w:rPr>
+        <w:t>• What I would improve: add larger graphs, measure nodes generated and peak frontier size, and validate tie-breaking rules explicitly.</w:t>
+      </w:r>
+    </w:p>
+    <w:p>
+      <w:r>
+        <w:rPr>
+          <w:b/>
+          <w:i w:val="0"/>
+        </w:rPr>
+        <w:t>9. Reproduction</w:t>
+      </w:r>
+    </w:p>
+    <w:p>
+      <w:pPr>
+        <w:pStyle w:val="NoSpacing"/>
+        <w:ind w:left="288"/>
+      </w:pPr>
+      <w:r>
+        <w:rPr>
+          <w:rFonts w:ascii="Consolas" w:hAnsi="Consolas"/>
+          <w:sz w:val="16"/>
+        </w:rPr>
+        <w:t>python Lab3.py</w:t>
+      </w:r>
+    </w:p>
+    <w:p>
+      <w:r>
+        <w:rPr>
+          <w:b w:val="0"/>
+          <w:i w:val="0"/>
+        </w:rPr>
+        <w:t>The submitted Lab3.py prints the state-space formulation, BFS/DFS traces, DLS limits 1–4, every IDDFS pass through depth 4, weighted BFS versus UCS, and the edge-case tests. It uses only Python 3 standard-library modules.</w:t>
+      </w:r>
+    </w:p>
+    <w:p>
+      <w:r>
+        <w:rPr>
+          <w:b/>
+          <w:i w:val="0"/>
+        </w:rPr>
+        <w:t>10. Source and Integrity Note</w:t>
+      </w:r>
+    </w:p>
+    <w:p>
+      <w:r>
+        <w:rPr>
+          <w:b w:val="0"/>
+          <w:i w:val="0"/>
+        </w:rPr>
+        <w:t>Algorithm descriptions and the supplied graph/requirements are based on the provided CAI601400 Combined AI Lab Manual, Lab 3, pages 12–15. The implementation is an original lab solution. The graph weights are synthetic educational assumptions, not real route measurements. Actual output is generated by the accompanying script.</w:t>
       </w:r>
     </w:p>
     <w:sectPr>
       <w:pgSz w:w="12240" w:h="15840"/>
-      <w:pgMar w:top="1440" w:right="1800" w:bottom="1440" w:left="1800" w:header="720" w:footer="720" w:gutter="0"/>
+      <w:pgMar w:top="936" w:right="1008" w:bottom="936" w:left="1008" w:header="720" w:footer="720" w:gutter="0"/>
       <w:cols w:space="720"/>
       <w:docGrid w:linePitch="360"/>
     </w:sectPr>
@@ -387,6 +2014,10 @@
     <w:name w:val="Normal"/>
     <w:qFormat/>
     <w:rsid w:val="00FC693F"/>
+    <w:rPr>
+      <w:rFonts w:ascii="Aptos" w:hAnsi="Aptos"/>
+      <w:sz w:val="20"/>
+    </w:rPr>
   </w:style>
   <w:style w:type="paragraph" w:styleId="Header">
     <w:name w:val="header"/>
@@ -447,11 +2078,11 @@
       <w:outlineLvl w:val="0"/>
     </w:pPr>
     <w:rPr>
-      <w:rFonts w:asciiTheme="majorHAnsi" w:eastAsiaTheme="majorEastAsia" w:hAnsiTheme="majorHAnsi" w:cstheme="majorBidi"/>
+      <w:rFonts w:asciiTheme="majorHAnsi" w:eastAsiaTheme="majorEastAsia" w:hAnsiTheme="majorHAnsi" w:cstheme="majorBidi" w:ascii="Aptos Display" w:hAnsi="Aptos Display"/>
       <w:b/>
       <w:bCs/>
-      <w:color w:val="365F91" w:themeColor="accent1" w:themeShade="BF"/>
-      <w:sz w:val="28"/>
+      <w:color w:val="5B1A7A"/>
+      <w:sz w:val="30"/>
       <w:szCs w:val="28"/>
     </w:rPr>
   </w:style>
@@ -471,11 +2102,11 @@
       <w:outlineLvl w:val="1"/>
     </w:pPr>
     <w:rPr>
-      <w:rFonts w:asciiTheme="majorHAnsi" w:eastAsiaTheme="majorEastAsia" w:hAnsiTheme="majorHAnsi" w:cstheme="majorBidi"/>
+      <w:rFonts w:asciiTheme="majorHAnsi" w:eastAsiaTheme="majorEastAsia" w:hAnsiTheme="majorHAnsi" w:cstheme="majorBidi" w:ascii="Aptos Display" w:hAnsi="Aptos Display"/>
       <w:b/>
       <w:bCs/>
-      <w:color w:val="4F81BD" w:themeColor="accent1"/>
-      <w:sz w:val="26"/>
+      <w:color w:val="7B2D8E"/>
+      <w:sz w:val="24"/>
       <w:szCs w:val="26"/>
     </w:rPr>
   </w:style>
@@ -736,11 +2367,11 @@
       <w:contextualSpacing/>
     </w:pPr>
     <w:rPr>
-      <w:rFonts w:asciiTheme="majorHAnsi" w:eastAsiaTheme="majorEastAsia" w:hAnsiTheme="majorHAnsi" w:cstheme="majorBidi"/>
-      <w:color w:val="17365D" w:themeColor="text2" w:themeShade="BF"/>
+      <w:rFonts w:asciiTheme="majorHAnsi" w:eastAsiaTheme="majorEastAsia" w:hAnsiTheme="majorHAnsi" w:cstheme="majorBidi" w:ascii="Aptos Display" w:hAnsi="Aptos Display"/>
+      <w:color w:val="5B1A7A"/>
       <w:spacing w:val="5"/>
       <w:kern w:val="28"/>
-      <w:sz w:val="52"/>
+      <w:sz w:val="40"/>
       <w:szCs w:val="52"/>
     </w:rPr>
   </w:style>

</xml_diff>